<commit_message>
Update localized DOCX report templates
</commit_message>
<xml_diff>
--- a/api/src/backend/api/v1/report_templates/en/findings_report/Findings Report.docx
+++ b/api/src/backend/api/v1/report_templates/en/findings_report/Findings Report.docx
@@ -6,9 +6,9 @@
       <w:pPr>
         <w:jc w:val="center"/>
         <w:rPr>
-          <w:rFonts w:eastAsia="DengXian"/>
-          <w:sz w:val="52"/>
-          <w:szCs w:val="52"/>
+          <w:rFonts w:eastAsia="Century" w:ascii="Century" w:hAnsi="Century" w:cs="Century"/>
+          <w:sz w:val="21"/>
+          <w:szCs w:val="21"/>
           <w:lang w:eastAsia="zh-CN"/>
         </w:rPr>
       </w:pPr>
@@ -19,9 +19,9 @@
       <w:pPr>
         <w:jc w:val="center"/>
         <w:rPr>
-          <w:rFonts w:eastAsia="DengXian"/>
-          <w:sz w:val="52"/>
-          <w:szCs w:val="52"/>
+          <w:rFonts w:eastAsia="Century" w:ascii="Century" w:hAnsi="Century" w:cs="Century"/>
+          <w:sz w:val="21"/>
+          <w:szCs w:val="21"/>
           <w:lang w:eastAsia="zh-CN"/>
         </w:rPr>
       </w:pPr>
@@ -30,9 +30,9 @@
       <w:pPr>
         <w:jc w:val="center"/>
         <w:rPr>
-          <w:rFonts w:eastAsia="DengXian"/>
-          <w:sz w:val="52"/>
-          <w:szCs w:val="52"/>
+          <w:rFonts w:eastAsia="Century" w:ascii="Century" w:hAnsi="Century" w:cs="Century"/>
+          <w:sz w:val="21"/>
+          <w:szCs w:val="21"/>
           <w:lang w:eastAsia="zh-CN"/>
         </w:rPr>
       </w:pPr>
@@ -41,9 +41,9 @@
       <w:pPr>
         <w:jc w:val="center"/>
         <w:rPr>
-          <w:rFonts w:eastAsia="DengXian"/>
-          <w:sz w:val="52"/>
-          <w:szCs w:val="52"/>
+          <w:rFonts w:eastAsia="Century" w:ascii="Century" w:hAnsi="Century" w:cs="Century"/>
+          <w:sz w:val="21"/>
+          <w:szCs w:val="21"/>
           <w:lang w:eastAsia="zh-CN"/>
         </w:rPr>
       </w:pPr>
@@ -52,16 +52,17 @@
       <w:pPr>
         <w:jc w:val="center"/>
         <w:rPr>
-          <w:rFonts w:eastAsia="DengXian"/>
-          <w:sz w:val="52"/>
-          <w:szCs w:val="52"/>
+          <w:rFonts w:eastAsia="Century" w:ascii="Century" w:hAnsi="Century" w:cs="Century"/>
+          <w:sz w:val="28"/>
+          <w:szCs w:val="28"/>
           <w:lang w:eastAsia="zh-CN"/>
         </w:rPr>
       </w:pPr>
       <w:r>
         <w:rPr>
-          <w:sz w:val="52"/>
-          <w:szCs w:val="52"/>
+          <w:rFonts w:ascii="Century" w:hAnsi="Century" w:eastAsia="Century" w:cs="Century"/>
+          <w:sz w:val="28"/>
+          <w:szCs w:val="28"/>
         </w:rPr>
         <w:t>Findings Report</w:t>
       </w:r>
@@ -71,9 +72,9 @@
       <w:pPr>
         <w:jc w:val="center"/>
         <w:rPr>
-          <w:rFonts w:eastAsia="DengXian"/>
-          <w:sz w:val="52"/>
-          <w:szCs w:val="52"/>
+          <w:rFonts w:eastAsia="Century" w:ascii="Century" w:hAnsi="Century" w:cs="Century"/>
+          <w:sz w:val="21"/>
+          <w:szCs w:val="21"/>
           <w:lang w:eastAsia="zh-CN"/>
         </w:rPr>
       </w:pPr>
@@ -83,11 +84,18 @@
         <w:pStyle w:val="FirstParagraph"/>
         <w:jc w:val="center"/>
         <w:rPr>
-          <w:rFonts w:eastAsia="DengXian" w:hint="eastAsia"/>
+          <w:rFonts w:eastAsia="Century" w:hint="eastAsia" w:ascii="Century" w:hAnsi="Century" w:cs="Century"/>
           <w:lang w:eastAsia="zh-CN"/>
+          <w:sz w:val="48"/>
+          <w:szCs w:val="48"/>
         </w:rPr>
       </w:pPr>
       <w:r>
+        <w:rPr>
+          <w:rFonts w:ascii="Century" w:hAnsi="Century" w:eastAsia="Century" w:cs="Century"/>
+          <w:sz w:val="48"/>
+          <w:szCs w:val="48"/>
+        </w:rPr>
         <w:t>Assessment Name: {{assessment_name}}</w:t>
       </w:r>
     </w:p>
@@ -96,11 +104,18 @@
         <w:pStyle w:val="a0"/>
         <w:jc w:val="center"/>
         <w:rPr>
-          <w:rFonts w:eastAsia="DengXian" w:hint="eastAsia"/>
+          <w:rFonts w:eastAsia="Century" w:hint="eastAsia" w:ascii="Century" w:hAnsi="Century" w:cs="Century"/>
           <w:lang w:eastAsia="zh-CN"/>
+          <w:sz w:val="28"/>
+          <w:szCs w:val="28"/>
         </w:rPr>
       </w:pPr>
       <w:r>
+        <w:rPr>
+          <w:rFonts w:ascii="Century" w:hAnsi="Century" w:eastAsia="Century" w:cs="Century"/>
+          <w:sz w:val="28"/>
+          <w:szCs w:val="28"/>
+        </w:rPr>
         <w:t>Cloud Provider: {{cloud_provider}}</w:t>
       </w:r>
     </w:p>
@@ -109,11 +124,18 @@
         <w:pStyle w:val="a0"/>
         <w:jc w:val="center"/>
         <w:rPr>
-          <w:rFonts w:eastAsia="DengXian" w:hint="eastAsia"/>
+          <w:rFonts w:eastAsia="Century" w:hint="eastAsia" w:ascii="Century" w:hAnsi="Century" w:cs="Century"/>
           <w:lang w:eastAsia="zh-CN"/>
+          <w:sz w:val="28"/>
+          <w:szCs w:val="28"/>
         </w:rPr>
       </w:pPr>
       <w:r>
+        <w:rPr>
+          <w:rFonts w:ascii="Century" w:hAnsi="Century" w:eastAsia="Century" w:cs="Century"/>
+          <w:sz w:val="28"/>
+          <w:szCs w:val="28"/>
+        </w:rPr>
         <w:t>Account ID: {{account_id}}</w:t>
       </w:r>
     </w:p>
@@ -122,22 +144,36 @@
         <w:pStyle w:val="a0"/>
         <w:jc w:val="center"/>
         <w:rPr>
-          <w:rFonts w:eastAsia="DengXian" w:hint="eastAsia"/>
+          <w:rFonts w:eastAsia="Century" w:hint="eastAsia" w:ascii="Century" w:hAnsi="Century" w:cs="Century"/>
           <w:lang w:eastAsia="zh-CN"/>
+          <w:sz w:val="24"/>
+          <w:szCs w:val="24"/>
         </w:rPr>
       </w:pPr>
       <w:r>
+        <w:rPr>
+          <w:rFonts w:ascii="Century" w:hAnsi="Century" w:eastAsia="Century" w:cs="Century"/>
+          <w:sz w:val="24"/>
+          <w:szCs w:val="24"/>
+        </w:rPr>
         <w:t>Assessment Date: {{assessment_date}}</w:t>
       </w:r>
     </w:p>
     <w:p>
       <w:pPr>
         <w:rPr>
-          <w:rFonts w:eastAsia="DengXian"/>
+          <w:rFonts w:eastAsia="Century" w:ascii="Century" w:hAnsi="Century" w:cs="Century"/>
           <w:lang w:eastAsia="zh-CN"/>
+          <w:sz w:val="21"/>
+          <w:szCs w:val="21"/>
         </w:rPr>
       </w:pPr>
       <w:r>
+        <w:rPr>
+          <w:rFonts w:ascii="Century" w:hAnsi="Century" w:eastAsia="Century" w:cs="Century"/>
+          <w:sz w:val="21"/>
+          <w:szCs w:val="21"/>
+        </w:rPr>
         <w:br w:type="page"/>
       </w:r>
     </w:p>
@@ -145,13 +181,19 @@
       <w:pPr>
         <w:pStyle w:val="1"/>
         <w:spacing w:before="160" w:after="100" w:line="252" w:lineRule="auto"/>
+        <w:rPr>
+          <w:rFonts w:ascii="Century" w:hAnsi="Century" w:eastAsia="Century" w:cs="Century"/>
+          <w:sz w:val="48"/>
+          <w:szCs w:val="48"/>
+        </w:rPr>
       </w:pPr>
       <w:r>
         <w:rPr>
-          <w:rFonts w:ascii="Arial" w:hAnsi="Arial" w:eastAsia="PingFang SC"/>
+          <w:rFonts w:ascii="Century" w:hAnsi="Century" w:eastAsia="Century" w:cs="Century"/>
           <w:b/>
           <w:color w:val="0F4C5C"/>
-          <w:sz w:val="40"/>
+          <w:sz w:val="48"/>
+          <w:szCs w:val="48"/>
         </w:rPr>
         <w:t>Table of Contents</w:t>
       </w:r>
@@ -163,13 +205,19 @@
         </w:tabs>
         <w:spacing w:after="40"/>
         <w:ind w:left="0"/>
+        <w:rPr>
+          <w:rFonts w:ascii="Century" w:hAnsi="Century" w:eastAsia="Century" w:cs="Century"/>
+          <w:sz w:val="24"/>
+          <w:szCs w:val="24"/>
+        </w:rPr>
       </w:pPr>
       <w:r>
         <w:rPr>
-          <w:rFonts w:ascii="Arial" w:hAnsi="Arial"/>
+          <w:rFonts w:ascii="Century" w:hAnsi="Century" w:eastAsia="Century" w:cs="Century"/>
           <w:b/>
           <w:color w:val="0F4C5C"/>
-          <w:sz w:val="21"/>
+          <w:sz w:val="24"/>
+          <w:szCs w:val="24"/>
         </w:rPr>
         <w:t>1. Findings Summary</w:t>
         <w:tab/>
@@ -183,12 +231,18 @@
         </w:tabs>
         <w:spacing w:after="40"/>
         <w:ind w:left="255"/>
+        <w:rPr>
+          <w:rFonts w:ascii="Century" w:hAnsi="Century" w:eastAsia="Century" w:cs="Century"/>
+          <w:sz w:val="20"/>
+          <w:szCs w:val="20"/>
+        </w:rPr>
       </w:pPr>
       <w:r>
         <w:rPr>
-          <w:rFonts w:ascii="Arial" w:hAnsi="Arial"/>
+          <w:rFonts w:ascii="Century" w:hAnsi="Century" w:eastAsia="Century" w:cs="Century"/>
           <w:b w:val="0"/>
-          <w:sz w:val="19"/>
+          <w:sz w:val="20"/>
+          <w:szCs w:val="20"/>
         </w:rPr>
         <w:t>1.1 Findings Statistics</w:t>
         <w:tab/>
@@ -202,13 +256,19 @@
         </w:tabs>
         <w:spacing w:after="40"/>
         <w:ind w:left="0"/>
+        <w:rPr>
+          <w:rFonts w:ascii="Century" w:hAnsi="Century" w:eastAsia="Century" w:cs="Century"/>
+          <w:sz w:val="24"/>
+          <w:szCs w:val="24"/>
+        </w:rPr>
       </w:pPr>
       <w:r>
         <w:rPr>
-          <w:rFonts w:ascii="Arial" w:hAnsi="Arial"/>
+          <w:rFonts w:ascii="Century" w:hAnsi="Century" w:eastAsia="Century" w:cs="Century"/>
           <w:b/>
           <w:color w:val="0F4C5C"/>
-          <w:sz w:val="21"/>
+          <w:sz w:val="24"/>
+          <w:szCs w:val="24"/>
         </w:rPr>
         <w:t>2. Finding Details</w:t>
         <w:tab/>
@@ -222,12 +282,18 @@
         </w:tabs>
         <w:spacing w:after="40"/>
         <w:ind w:left="255"/>
+        <w:rPr>
+          <w:rFonts w:ascii="Century" w:hAnsi="Century" w:eastAsia="Century" w:cs="Century"/>
+          <w:sz w:val="20"/>
+          <w:szCs w:val="20"/>
+        </w:rPr>
       </w:pPr>
       <w:r>
         <w:rPr>
-          <w:rFonts w:ascii="Arial" w:hAnsi="Arial"/>
+          <w:rFonts w:ascii="Century" w:hAnsi="Century" w:eastAsia="Century" w:cs="Century"/>
           <w:b w:val="0"/>
-          <w:sz w:val="19"/>
+          <w:sz w:val="20"/>
+          <w:szCs w:val="20"/>
         </w:rPr>
         <w:t>2.1 Finding {{finding_number}}</w:t>
         <w:tab/>
@@ -241,12 +307,18 @@
         </w:tabs>
         <w:spacing w:after="40"/>
         <w:ind w:left="510"/>
+        <w:rPr>
+          <w:rFonts w:ascii="Century" w:hAnsi="Century" w:eastAsia="Century" w:cs="Century"/>
+          <w:sz w:val="24"/>
+          <w:szCs w:val="24"/>
+        </w:rPr>
       </w:pPr>
       <w:r>
         <w:rPr>
-          <w:rFonts w:ascii="Arial" w:hAnsi="Arial"/>
+          <w:rFonts w:ascii="Century" w:hAnsi="Century" w:eastAsia="Century" w:cs="Century"/>
           <w:b w:val="0"/>
-          <w:sz w:val="19"/>
+          <w:sz w:val="24"/>
+          <w:szCs w:val="24"/>
         </w:rPr>
         <w:t>2.1.1 Overview</w:t>
         <w:tab/>
@@ -260,12 +332,18 @@
         </w:tabs>
         <w:spacing w:after="40"/>
         <w:ind w:left="510"/>
+        <w:rPr>
+          <w:rFonts w:ascii="Century" w:hAnsi="Century" w:eastAsia="Century" w:cs="Century"/>
+          <w:sz w:val="24"/>
+          <w:szCs w:val="24"/>
+        </w:rPr>
       </w:pPr>
       <w:r>
         <w:rPr>
-          <w:rFonts w:ascii="Arial" w:hAnsi="Arial"/>
+          <w:rFonts w:ascii="Century" w:hAnsi="Century" w:eastAsia="Century" w:cs="Century"/>
           <w:b w:val="0"/>
-          <w:sz w:val="19"/>
+          <w:sz w:val="24"/>
+          <w:szCs w:val="24"/>
         </w:rPr>
         <w:t>2.1.2 Executive Summary</w:t>
         <w:tab/>
@@ -279,12 +357,18 @@
         </w:tabs>
         <w:spacing w:after="40"/>
         <w:ind w:left="510"/>
+        <w:rPr>
+          <w:rFonts w:ascii="Century" w:hAnsi="Century" w:eastAsia="Century" w:cs="Century"/>
+          <w:sz w:val="24"/>
+          <w:szCs w:val="24"/>
+        </w:rPr>
       </w:pPr>
       <w:r>
         <w:rPr>
-          <w:rFonts w:ascii="Arial" w:hAnsi="Arial"/>
+          <w:rFonts w:ascii="Century" w:hAnsi="Century" w:eastAsia="Century" w:cs="Century"/>
           <w:b w:val="0"/>
-          <w:sz w:val="19"/>
+          <w:sz w:val="24"/>
+          <w:szCs w:val="24"/>
         </w:rPr>
         <w:t>2.1.3 Affected Resources</w:t>
         <w:tab/>
@@ -298,12 +382,18 @@
         </w:tabs>
         <w:spacing w:after="40"/>
         <w:ind w:left="510"/>
+        <w:rPr>
+          <w:rFonts w:ascii="Century" w:hAnsi="Century" w:eastAsia="Century" w:cs="Century"/>
+          <w:sz w:val="24"/>
+          <w:szCs w:val="24"/>
+        </w:rPr>
       </w:pPr>
       <w:r>
         <w:rPr>
-          <w:rFonts w:ascii="Arial" w:hAnsi="Arial"/>
+          <w:rFonts w:ascii="Century" w:hAnsi="Century" w:eastAsia="Century" w:cs="Century"/>
           <w:b w:val="0"/>
-          <w:sz w:val="19"/>
+          <w:sz w:val="24"/>
+          <w:szCs w:val="24"/>
         </w:rPr>
         <w:t>2.1.4 Remediation Guidance</w:t>
         <w:tab/>
@@ -317,12 +407,18 @@
         </w:tabs>
         <w:spacing w:after="40"/>
         <w:ind w:left="510"/>
+        <w:rPr>
+          <w:rFonts w:ascii="Century" w:hAnsi="Century" w:eastAsia="Century" w:cs="Century"/>
+          <w:sz w:val="24"/>
+          <w:szCs w:val="24"/>
+        </w:rPr>
       </w:pPr>
       <w:r>
         <w:rPr>
-          <w:rFonts w:ascii="Arial" w:hAnsi="Arial"/>
+          <w:rFonts w:ascii="Century" w:hAnsi="Century" w:eastAsia="Century" w:cs="Century"/>
           <w:b w:val="0"/>
-          <w:sz w:val="19"/>
+          <w:sz w:val="24"/>
+          <w:szCs w:val="24"/>
         </w:rPr>
         <w:t>2.1.5 References</w:t>
         <w:tab/>
@@ -336,13 +432,19 @@
         </w:tabs>
         <w:spacing w:after="40"/>
         <w:ind w:left="0"/>
+        <w:rPr>
+          <w:rFonts w:ascii="Century" w:hAnsi="Century" w:eastAsia="Century" w:cs="Century"/>
+          <w:sz w:val="24"/>
+          <w:szCs w:val="24"/>
+        </w:rPr>
       </w:pPr>
       <w:r>
         <w:rPr>
-          <w:rFonts w:ascii="Arial" w:hAnsi="Arial"/>
+          <w:rFonts w:ascii="Century" w:hAnsi="Century" w:eastAsia="Century" w:cs="Century"/>
           <w:b/>
           <w:color w:val="0F4C5C"/>
-          <w:sz w:val="21"/>
+          <w:sz w:val="24"/>
+          <w:szCs w:val="24"/>
         </w:rPr>
         <w:t>Appendix A. Severity Definitions</w:t>
         <w:tab/>
@@ -350,7 +452,19 @@
       </w:r>
     </w:p>
     <w:p>
+      <w:pPr>
+        <w:rPr>
+          <w:rFonts w:ascii="Century" w:hAnsi="Century" w:eastAsia="Century" w:cs="Century"/>
+          <w:sz w:val="21"/>
+          <w:szCs w:val="21"/>
+        </w:rPr>
+      </w:pPr>
       <w:r>
+        <w:rPr>
+          <w:rFonts w:ascii="Century" w:hAnsi="Century" w:eastAsia="Century" w:cs="Century"/>
+          <w:sz w:val="21"/>
+          <w:szCs w:val="21"/>
+        </w:rPr>
         <w:br w:type="page"/>
       </w:r>
     </w:p>
@@ -358,16 +472,22 @@
       <w:pPr>
         <w:pStyle w:val="1"/>
         <w:spacing w:before="160" w:after="100" w:line="252" w:lineRule="auto"/>
+        <w:rPr>
+          <w:rFonts w:ascii="Century" w:hAnsi="Century" w:eastAsia="Century" w:cs="Century"/>
+          <w:sz w:val="36"/>
+          <w:szCs w:val="36"/>
+        </w:rPr>
       </w:pPr>
       <w:bookmarkStart w:id="6" w:name="findings-summary"/>
       <w:bookmarkStart w:id="7" w:name="_Toc232007591"/>
       <w:bookmarkEnd w:id="4"/>
       <w:r>
         <w:rPr>
-          <w:rFonts w:ascii="Arial" w:hAnsi="Arial" w:eastAsia="PingFang SC"/>
+          <w:rFonts w:ascii="Century" w:hAnsi="Century" w:eastAsia="Century" w:cs="Century"/>
           <w:b/>
           <w:color w:val="0F4C5C"/>
-          <w:sz w:val="40"/>
+          <w:sz w:val="36"/>
+          <w:szCs w:val="36"/>
         </w:rPr>
         <w:lastRenderedPageBreak/>
         <w:t>1. Findings Summary</w:t>
@@ -378,15 +498,21 @@
       <w:pPr>
         <w:pStyle w:val="2"/>
         <w:spacing w:before="160" w:after="100" w:line="252" w:lineRule="auto"/>
+        <w:rPr>
+          <w:rFonts w:ascii="Century" w:hAnsi="Century" w:eastAsia="Century" w:cs="Century"/>
+          <w:sz w:val="28"/>
+          <w:szCs w:val="28"/>
+        </w:rPr>
       </w:pPr>
       <w:bookmarkStart w:id="8" w:name="findings-statistics"/>
       <w:bookmarkStart w:id="9" w:name="_Toc232007592"/>
       <w:r>
         <w:rPr>
-          <w:rFonts w:ascii="Arial" w:hAnsi="Arial" w:eastAsia="PingFang SC"/>
+          <w:rFonts w:ascii="Century" w:hAnsi="Century" w:eastAsia="Century" w:cs="Century"/>
           <w:b/>
           <w:color w:val="0F4C5C"/>
-          <w:sz w:val="30"/>
+          <w:sz w:val="28"/>
+          <w:szCs w:val="28"/>
         </w:rPr>
         <w:t>1.1 Findings Statistics</w:t>
       </w:r>
@@ -398,13 +524,19 @@
         <w:spacing w:before="120" w:after="120"/>
         <w:ind w:left="0" w:firstLine="0"/>
         <w:jc w:val="center"/>
+        <w:rPr>
+          <w:rFonts w:ascii="Century" w:hAnsi="Century" w:eastAsia="Century" w:cs="Century"/>
+          <w:sz w:val="21"/>
+          <w:szCs w:val="21"/>
+        </w:rPr>
       </w:pPr>
       <w:r>
         <w:rPr>
-          <w:rFonts w:ascii="Arial" w:hAnsi="Arial"/>
+          <w:rFonts w:ascii="Century" w:hAnsi="Century" w:eastAsia="Century" w:cs="Century"/>
           <w:b/>
           <w:bCs/>
           <w:sz w:val="21"/>
+          <w:szCs w:val="21"/>
         </w:rPr>
         <w:t>Table 1-1 Findings Summary</w:t>
       </w:r>
@@ -454,13 +586,19 @@
             <w:pPr>
               <w:pStyle w:val="Compact"/>
               <w:spacing w:before="0" w:after="0" w:line="252" w:lineRule="auto"/>
+              <w:rPr>
+                <w:rFonts w:ascii="Century" w:hAnsi="Century" w:eastAsia="Century" w:cs="Century"/>
+                <w:sz w:val="21"/>
+                <w:szCs w:val="21"/>
+              </w:rPr>
             </w:pPr>
             <w:r>
               <w:rPr>
-                <w:rFonts w:ascii="Arial" w:hAnsi="Arial"/>
+                <w:rFonts w:ascii="Century" w:hAnsi="Century" w:eastAsia="Century" w:cs="Century"/>
                 <w:b/>
                 <w:color w:val="FFFFFF"/>
-                <w:sz w:val="18"/>
+                <w:sz w:val="21"/>
+                <w:szCs w:val="21"/>
               </w:rPr>
               <w:t>Severity</w:t>
             </w:r>
@@ -485,13 +623,19 @@
             <w:pPr>
               <w:pStyle w:val="Compact"/>
               <w:spacing w:before="0" w:after="0" w:line="252" w:lineRule="auto"/>
+              <w:rPr>
+                <w:rFonts w:ascii="Century" w:hAnsi="Century" w:eastAsia="Century" w:cs="Century"/>
+                <w:sz w:val="21"/>
+                <w:szCs w:val="21"/>
+              </w:rPr>
             </w:pPr>
             <w:r>
               <w:rPr>
-                <w:rFonts w:ascii="Arial" w:hAnsi="Arial"/>
+                <w:rFonts w:ascii="Century" w:hAnsi="Century" w:eastAsia="Century" w:cs="Century"/>
                 <w:b/>
                 <w:color w:val="FFFFFF"/>
-                <w:sz w:val="18"/>
+                <w:sz w:val="21"/>
+                <w:szCs w:val="21"/>
               </w:rPr>
               <w:t>Count</w:t>
             </w:r>
@@ -514,13 +658,19 @@
             <w:pPr>
               <w:pStyle w:val="Compact"/>
               <w:spacing w:before="0" w:after="0" w:line="252" w:lineRule="auto"/>
+              <w:rPr>
+                <w:rFonts w:ascii="Century" w:hAnsi="Century" w:eastAsia="Century" w:cs="Century"/>
+                <w:sz w:val="21"/>
+                <w:szCs w:val="21"/>
+              </w:rPr>
             </w:pPr>
             <w:r>
               <w:rPr>
-                <w:rFonts w:ascii="Arial" w:hAnsi="Arial"/>
+                <w:rFonts w:ascii="Century" w:hAnsi="Century" w:eastAsia="Century" w:cs="Century"/>
                 <w:b/>
                 <w:color w:val="990000"/>
-                <w:sz w:val="18"/>
+                <w:sz w:val="21"/>
+                <w:szCs w:val="21"/>
               </w:rPr>
               <w:t>Critical</w:t>
             </w:r>
@@ -542,15 +692,18 @@
               <w:pStyle w:val="Compact"/>
               <w:spacing w:before="0" w:after="0" w:line="252" w:lineRule="auto"/>
               <w:rPr>
-                <w:rFonts w:eastAsia="DengXian" w:hint="eastAsia"/>
+                <w:rFonts w:eastAsia="Century" w:hint="eastAsia" w:ascii="Century" w:hAnsi="Century" w:cs="Century"/>
                 <w:lang w:eastAsia="zh-CN"/>
+                <w:sz w:val="21"/>
+                <w:szCs w:val="21"/>
               </w:rPr>
             </w:pPr>
             <w:r>
               <w:rPr>
-                <w:rFonts w:eastAsia="DengXian" w:hint="eastAsia" w:ascii="Arial" w:hAnsi="Arial"/>
-                <w:sz w:val="18"/>
+                <w:rFonts w:eastAsia="Century" w:hint="eastAsia" w:ascii="Century" w:hAnsi="Century" w:cs="Century"/>
+                <w:sz w:val="21"/>
                 <w:lang w:eastAsia="zh-CN"/>
+                <w:szCs w:val="21"/>
               </w:rPr>
               <w:t>0</w:t>
             </w:r>
@@ -573,13 +726,19 @@
             <w:pPr>
               <w:pStyle w:val="Compact"/>
               <w:spacing w:before="0" w:after="0" w:line="252" w:lineRule="auto"/>
+              <w:rPr>
+                <w:rFonts w:ascii="Century" w:hAnsi="Century" w:eastAsia="Century" w:cs="Century"/>
+                <w:sz w:val="21"/>
+                <w:szCs w:val="21"/>
+              </w:rPr>
             </w:pPr>
             <w:r>
               <w:rPr>
-                <w:rFonts w:ascii="Arial" w:hAnsi="Arial"/>
+                <w:rFonts w:ascii="Century" w:hAnsi="Century" w:eastAsia="Century" w:cs="Century"/>
                 <w:b/>
                 <w:color w:val="C65911"/>
-                <w:sz w:val="18"/>
+                <w:sz w:val="21"/>
+                <w:szCs w:val="21"/>
               </w:rPr>
               <w:t>High</w:t>
             </w:r>
@@ -601,15 +760,18 @@
               <w:pStyle w:val="Compact"/>
               <w:spacing w:before="0" w:after="0" w:line="252" w:lineRule="auto"/>
               <w:rPr>
-                <w:rFonts w:eastAsia="DengXian" w:hint="eastAsia"/>
+                <w:rFonts w:eastAsia="Century" w:hint="eastAsia" w:ascii="Century" w:hAnsi="Century" w:cs="Century"/>
                 <w:lang w:eastAsia="zh-CN"/>
+                <w:sz w:val="21"/>
+                <w:szCs w:val="21"/>
               </w:rPr>
             </w:pPr>
             <w:r>
               <w:rPr>
-                <w:rFonts w:eastAsia="DengXian" w:hint="eastAsia" w:ascii="Arial" w:hAnsi="Arial"/>
-                <w:sz w:val="18"/>
+                <w:rFonts w:eastAsia="Century" w:hint="eastAsia" w:ascii="Century" w:hAnsi="Century" w:cs="Century"/>
+                <w:sz w:val="21"/>
                 <w:lang w:eastAsia="zh-CN"/>
+                <w:szCs w:val="21"/>
               </w:rPr>
               <w:t>2</w:t>
             </w:r>
@@ -632,13 +794,19 @@
             <w:pPr>
               <w:pStyle w:val="Compact"/>
               <w:spacing w:before="0" w:after="0" w:line="252" w:lineRule="auto"/>
+              <w:rPr>
+                <w:rFonts w:ascii="Century" w:hAnsi="Century" w:eastAsia="Century" w:cs="Century"/>
+                <w:sz w:val="21"/>
+                <w:szCs w:val="21"/>
+              </w:rPr>
             </w:pPr>
             <w:r>
               <w:rPr>
-                <w:rFonts w:ascii="Arial" w:hAnsi="Arial"/>
+                <w:rFonts w:ascii="Century" w:hAnsi="Century" w:eastAsia="Century" w:cs="Century"/>
                 <w:b/>
                 <w:color w:val="9C6500"/>
-                <w:sz w:val="18"/>
+                <w:sz w:val="21"/>
+                <w:szCs w:val="21"/>
               </w:rPr>
               <w:t>Medium</w:t>
             </w:r>
@@ -660,15 +828,18 @@
               <w:pStyle w:val="Compact"/>
               <w:spacing w:before="0" w:after="0" w:line="252" w:lineRule="auto"/>
               <w:rPr>
-                <w:rFonts w:eastAsia="DengXian" w:hint="eastAsia"/>
+                <w:rFonts w:eastAsia="Century" w:hint="eastAsia" w:ascii="Century" w:hAnsi="Century" w:cs="Century"/>
                 <w:lang w:eastAsia="zh-CN"/>
+                <w:sz w:val="21"/>
+                <w:szCs w:val="21"/>
               </w:rPr>
             </w:pPr>
             <w:r>
               <w:rPr>
-                <w:rFonts w:eastAsia="DengXian" w:hint="eastAsia" w:ascii="Arial" w:hAnsi="Arial"/>
-                <w:sz w:val="18"/>
+                <w:rFonts w:eastAsia="Century" w:hint="eastAsia" w:ascii="Century" w:hAnsi="Century" w:cs="Century"/>
+                <w:sz w:val="21"/>
                 <w:lang w:eastAsia="zh-CN"/>
+                <w:szCs w:val="21"/>
               </w:rPr>
               <w:t>0</w:t>
             </w:r>
@@ -691,13 +862,19 @@
             <w:pPr>
               <w:pStyle w:val="Compact"/>
               <w:spacing w:before="0" w:after="0" w:line="252" w:lineRule="auto"/>
+              <w:rPr>
+                <w:rFonts w:ascii="Century" w:hAnsi="Century" w:eastAsia="Century" w:cs="Century"/>
+                <w:sz w:val="21"/>
+                <w:szCs w:val="21"/>
+              </w:rPr>
             </w:pPr>
             <w:r>
               <w:rPr>
-                <w:rFonts w:ascii="Arial" w:hAnsi="Arial"/>
+                <w:rFonts w:ascii="Century" w:hAnsi="Century" w:eastAsia="Century" w:cs="Century"/>
                 <w:b/>
                 <w:color w:val="375E1D"/>
-                <w:sz w:val="18"/>
+                <w:sz w:val="21"/>
+                <w:szCs w:val="21"/>
               </w:rPr>
               <w:t>Low</w:t>
             </w:r>
@@ -719,15 +896,18 @@
               <w:pStyle w:val="Compact"/>
               <w:spacing w:before="0" w:after="0" w:line="252" w:lineRule="auto"/>
               <w:rPr>
-                <w:rFonts w:eastAsia="DengXian" w:hint="eastAsia"/>
+                <w:rFonts w:eastAsia="Century" w:hint="eastAsia" w:ascii="Century" w:hAnsi="Century" w:cs="Century"/>
                 <w:lang w:eastAsia="zh-CN"/>
+                <w:sz w:val="21"/>
+                <w:szCs w:val="21"/>
               </w:rPr>
             </w:pPr>
             <w:r>
               <w:rPr>
-                <w:rFonts w:eastAsia="DengXian" w:hint="eastAsia" w:ascii="Arial" w:hAnsi="Arial"/>
-                <w:sz w:val="18"/>
+                <w:rFonts w:eastAsia="Century" w:hint="eastAsia" w:ascii="Century" w:hAnsi="Century" w:cs="Century"/>
+                <w:sz w:val="21"/>
                 <w:lang w:eastAsia="zh-CN"/>
+                <w:szCs w:val="21"/>
               </w:rPr>
               <w:t>0</w:t>
             </w:r>
@@ -743,17 +923,19 @@
         <w:jc w:val="center"/>
         <w:rPr>
           <w:rStyle w:val="VerbatimChar"/>
-          <w:rFonts w:asciiTheme="minorHAnsi" w:eastAsia="DengXian" w:hAnsiTheme="minorHAnsi" w:hint="eastAsia"/>
-          <w:sz w:val="24"/>
+          <w:rFonts w:eastAsia="Century" w:hint="eastAsia" w:ascii="Century" w:hAnsi="Century" w:cs="Century"/>
+          <w:sz w:val="21"/>
           <w:lang w:eastAsia="zh-CN"/>
+          <w:szCs w:val="21"/>
         </w:rPr>
       </w:pPr>
       <w:r>
         <w:rPr>
-          <w:rFonts w:ascii="Arial" w:hAnsi="Arial"/>
+          <w:rFonts w:ascii="Century" w:hAnsi="Century" w:eastAsia="Century" w:cs="Century"/>
           <w:b/>
           <w:bCs/>
           <w:sz w:val="21"/>
+          <w:szCs w:val="21"/>
         </w:rPr>
         <w:t>Figure 1-1 Findings Distribution</w:t>
       </w:r>
@@ -763,15 +945,19 @@
         <w:pStyle w:val="SourceCode"/>
         <w:jc w:val="center"/>
         <w:rPr>
-          <w:rFonts w:eastAsia="DengXian" w:hint="eastAsia"/>
+          <w:rFonts w:eastAsia="Century" w:hint="eastAsia" w:ascii="Century" w:hAnsi="Century" w:cs="Century"/>
           <w:lang w:eastAsia="zh-CN"/>
+          <w:sz w:val="21"/>
+          <w:szCs w:val="21"/>
         </w:rPr>
       </w:pPr>
       <w:r>
         <w:rPr>
-          <w:rFonts w:eastAsia="DengXian" w:hint="eastAsia"/>
+          <w:rFonts w:eastAsia="Century" w:hint="eastAsia" w:ascii="Century" w:hAnsi="Century" w:cs="Century"/>
           <w:noProof/>
           <w:lang w:eastAsia="zh-CN"/>
+          <w:sz w:val="21"/>
+          <w:szCs w:val="21"/>
         </w:rPr>
         <w:drawing>
           <wp:inline distT="0" distB="0" distL="0" distR="0" wp14:anchorId="14C1F6AF" wp14:editId="26D89C61">
@@ -793,8 +979,10 @@
         <w:pStyle w:val="1"/>
         <w:spacing w:before="160" w:after="100" w:line="252" w:lineRule="auto"/>
         <w:rPr>
-          <w:rFonts w:eastAsia="DengXian" w:hint="eastAsia"/>
+          <w:rFonts w:eastAsia="Century" w:hint="eastAsia" w:ascii="Century" w:hAnsi="Century" w:cs="Century"/>
           <w:lang w:eastAsia="zh-CN"/>
+          <w:sz w:val="36"/>
+          <w:szCs w:val="36"/>
         </w:rPr>
       </w:pPr>
       <w:bookmarkStart w:id="10" w:name="finding-details"/>
@@ -803,10 +991,11 @@
       <w:bookmarkEnd w:id="8"/>
       <w:r>
         <w:rPr>
-          <w:rFonts w:ascii="Arial" w:hAnsi="Arial" w:eastAsia="PingFang SC"/>
+          <w:rFonts w:ascii="Century" w:hAnsi="Century" w:eastAsia="Century" w:cs="Century"/>
           <w:b/>
           <w:color w:val="0F4C5C"/>
-          <w:sz w:val="40"/>
+          <w:sz w:val="36"/>
+          <w:szCs w:val="36"/>
         </w:rPr>
         <w:lastRenderedPageBreak/>
         <w:t>2. Finding Details</w:t>
@@ -817,13 +1006,19 @@
       <w:pPr>
         <w:pStyle w:val="2"/>
         <w:spacing w:before="160" w:after="100" w:line="252" w:lineRule="auto"/>
+        <w:rPr>
+          <w:rFonts w:ascii="Century" w:hAnsi="Century" w:eastAsia="Century" w:cs="Century"/>
+          <w:sz w:val="28"/>
+          <w:szCs w:val="28"/>
+        </w:rPr>
       </w:pPr>
       <w:r>
         <w:rPr>
-          <w:rFonts w:ascii="Arial" w:hAnsi="Arial" w:eastAsia="PingFang SC"/>
+          <w:rFonts w:ascii="Century" w:hAnsi="Century" w:eastAsia="Century" w:cs="Century"/>
           <w:b/>
           <w:color w:val="0F4C5C"/>
-          <w:sz w:val="30"/>
+          <w:sz w:val="28"/>
+          <w:szCs w:val="28"/>
         </w:rPr>
         <w:t>2.1 Finding {{finding_number}}</w:t>
       </w:r>
@@ -832,15 +1027,21 @@
       <w:pPr>
         <w:pStyle w:val="3"/>
         <w:spacing w:before="160" w:after="100" w:line="252" w:lineRule="auto"/>
+        <w:rPr>
+          <w:rFonts w:ascii="Century" w:hAnsi="Century" w:eastAsia="Century" w:cs="Century"/>
+          <w:sz w:val="24"/>
+          <w:szCs w:val="24"/>
+        </w:rPr>
       </w:pPr>
       <w:bookmarkStart w:id="14" w:name="overview"/>
       <w:bookmarkStart w:id="15" w:name="_Toc232007595"/>
       <w:r>
         <w:rPr>
-          <w:rFonts w:ascii="Arial" w:hAnsi="Arial" w:eastAsia="PingFang SC"/>
+          <w:rFonts w:ascii="Century" w:hAnsi="Century" w:eastAsia="Century" w:cs="Century"/>
           <w:b/>
           <w:color w:val="0F4C5C"/>
           <w:sz w:val="24"/>
+          <w:szCs w:val="24"/>
         </w:rPr>
         <w:t>2.1.1 Overview</w:t>
       </w:r>
@@ -852,13 +1053,19 @@
         <w:spacing w:before="120" w:after="120"/>
         <w:ind w:left="0" w:firstLine="0"/>
         <w:jc w:val="center"/>
+        <w:rPr>
+          <w:rFonts w:ascii="Century" w:hAnsi="Century" w:eastAsia="Century" w:cs="Century"/>
+          <w:sz w:val="21"/>
+          <w:szCs w:val="21"/>
+        </w:rPr>
       </w:pPr>
       <w:r>
         <w:rPr>
-          <w:rFonts w:ascii="Arial" w:hAnsi="Arial"/>
+          <w:rFonts w:ascii="Century" w:hAnsi="Century" w:eastAsia="Century" w:cs="Century"/>
           <w:b/>
           <w:bCs/>
           <w:sz w:val="21"/>
+          <w:szCs w:val="21"/>
         </w:rPr>
         <w:t>Table 2-1 Finding Overview</w:t>
       </w:r>
@@ -908,13 +1115,19 @@
             <w:pPr>
               <w:pStyle w:val="Compact"/>
               <w:spacing w:before="0" w:after="0" w:line="252" w:lineRule="auto"/>
+              <w:rPr>
+                <w:rFonts w:ascii="Century" w:hAnsi="Century" w:eastAsia="Century" w:cs="Century"/>
+                <w:sz w:val="21"/>
+                <w:szCs w:val="21"/>
+              </w:rPr>
             </w:pPr>
             <w:r>
               <w:rPr>
-                <w:rFonts w:ascii="Arial" w:hAnsi="Arial"/>
+                <w:rFonts w:ascii="Century" w:hAnsi="Century" w:eastAsia="Century" w:cs="Century"/>
                 <w:b/>
                 <w:color w:val="FFFFFF"/>
-                <w:sz w:val="18"/>
+                <w:sz w:val="21"/>
+                <w:szCs w:val="21"/>
               </w:rPr>
               <w:t>Field</w:t>
             </w:r>
@@ -939,13 +1152,19 @@
             <w:pPr>
               <w:pStyle w:val="Compact"/>
               <w:spacing w:before="0" w:after="0" w:line="252" w:lineRule="auto"/>
+              <w:rPr>
+                <w:rFonts w:ascii="Century" w:hAnsi="Century" w:eastAsia="Century" w:cs="Century"/>
+                <w:sz w:val="21"/>
+                <w:szCs w:val="21"/>
+              </w:rPr>
             </w:pPr>
             <w:r>
               <w:rPr>
-                <w:rFonts w:ascii="Arial" w:hAnsi="Arial"/>
+                <w:rFonts w:ascii="Century" w:hAnsi="Century" w:eastAsia="Century" w:cs="Century"/>
                 <w:b/>
                 <w:color w:val="FFFFFF"/>
-                <w:sz w:val="18"/>
+                <w:sz w:val="21"/>
+                <w:szCs w:val="21"/>
               </w:rPr>
               <w:t>Value</w:t>
             </w:r>
@@ -968,11 +1187,17 @@
             <w:pPr>
               <w:pStyle w:val="Compact"/>
               <w:spacing w:before="0" w:after="0" w:line="252" w:lineRule="auto"/>
+              <w:rPr>
+                <w:rFonts w:ascii="Century" w:hAnsi="Century" w:eastAsia="Century" w:cs="Century"/>
+                <w:sz w:val="21"/>
+                <w:szCs w:val="21"/>
+              </w:rPr>
             </w:pPr>
             <w:r>
               <w:rPr>
-                <w:rFonts w:ascii="Arial" w:hAnsi="Arial"/>
-                <w:sz w:val="18"/>
+                <w:rFonts w:ascii="Century" w:hAnsi="Century" w:eastAsia="Century" w:cs="Century"/>
+                <w:sz w:val="21"/>
+                <w:szCs w:val="21"/>
               </w:rPr>
               <w:t>Finding ID</w:t>
             </w:r>
@@ -993,11 +1218,17 @@
             <w:pPr>
               <w:pStyle w:val="Compact"/>
               <w:spacing w:before="0" w:after="0" w:line="252" w:lineRule="auto"/>
+              <w:rPr>
+                <w:rFonts w:ascii="Century" w:hAnsi="Century" w:eastAsia="Century" w:cs="Century"/>
+                <w:sz w:val="21"/>
+                <w:szCs w:val="21"/>
+              </w:rPr>
             </w:pPr>
             <w:r>
               <w:rPr>
-                <w:rFonts w:ascii="Arial" w:hAnsi="Arial"/>
-                <w:sz w:val="18"/>
+                <w:rFonts w:ascii="Century" w:hAnsi="Century" w:eastAsia="Century" w:cs="Century"/>
+                <w:sz w:val="21"/>
+                <w:szCs w:val="21"/>
               </w:rPr>
               <w:t>F-001</w:t>
             </w:r>
@@ -1020,11 +1251,17 @@
             <w:pPr>
               <w:pStyle w:val="Compact"/>
               <w:spacing w:before="0" w:after="0" w:line="252" w:lineRule="auto"/>
+              <w:rPr>
+                <w:rFonts w:ascii="Century" w:hAnsi="Century" w:eastAsia="Century" w:cs="Century"/>
+                <w:sz w:val="21"/>
+                <w:szCs w:val="21"/>
+              </w:rPr>
             </w:pPr>
             <w:r>
               <w:rPr>
-                <w:rFonts w:ascii="Arial" w:hAnsi="Arial"/>
-                <w:sz w:val="18"/>
+                <w:rFonts w:ascii="Century" w:hAnsi="Century" w:eastAsia="Century" w:cs="Century"/>
+                <w:sz w:val="21"/>
+                <w:szCs w:val="21"/>
               </w:rPr>
               <w:t>Check ID</w:t>
             </w:r>
@@ -1045,12 +1282,18 @@
             <w:pPr>
               <w:pStyle w:val="Compact"/>
               <w:spacing w:before="0" w:after="0" w:line="252" w:lineRule="auto"/>
+              <w:rPr>
+                <w:rFonts w:ascii="Century" w:hAnsi="Century" w:eastAsia="Century" w:cs="Century"/>
+                <w:sz w:val="21"/>
+                <w:szCs w:val="21"/>
+              </w:rPr>
             </w:pPr>
             <w:proofErr w:type="spellStart"/>
             <w:r>
               <w:rPr>
-                <w:rFonts w:ascii="Arial" w:hAnsi="Arial"/>
-                <w:sz w:val="18"/>
+                <w:rFonts w:ascii="Century" w:hAnsi="Century" w:eastAsia="Century" w:cs="Century"/>
+                <w:sz w:val="21"/>
+                <w:szCs w:val="21"/>
               </w:rPr>
               <w:t>cloudtrail_multi_region_enabled</w:t>
             </w:r>
@@ -1074,11 +1317,17 @@
             <w:pPr>
               <w:pStyle w:val="Compact"/>
               <w:spacing w:before="0" w:after="0" w:line="252" w:lineRule="auto"/>
+              <w:rPr>
+                <w:rFonts w:ascii="Century" w:hAnsi="Century" w:eastAsia="Century" w:cs="Century"/>
+                <w:sz w:val="21"/>
+                <w:szCs w:val="21"/>
+              </w:rPr>
             </w:pPr>
             <w:r>
               <w:rPr>
-                <w:rFonts w:ascii="Arial" w:hAnsi="Arial"/>
-                <w:sz w:val="18"/>
+                <w:rFonts w:ascii="Century" w:hAnsi="Century" w:eastAsia="Century" w:cs="Century"/>
+                <w:sz w:val="21"/>
+                <w:szCs w:val="21"/>
               </w:rPr>
               <w:t>Check Title</w:t>
             </w:r>
@@ -1099,11 +1348,17 @@
             <w:pPr>
               <w:pStyle w:val="Compact"/>
               <w:spacing w:before="0" w:after="0" w:line="252" w:lineRule="auto"/>
+              <w:rPr>
+                <w:rFonts w:ascii="Century" w:hAnsi="Century" w:eastAsia="Century" w:cs="Century"/>
+                <w:sz w:val="21"/>
+                <w:szCs w:val="21"/>
+              </w:rPr>
             </w:pPr>
             <w:r>
               <w:rPr>
-                <w:rFonts w:ascii="Arial" w:hAnsi="Arial"/>
-                <w:sz w:val="18"/>
+                <w:rFonts w:ascii="Century" w:hAnsi="Century" w:eastAsia="Century" w:cs="Century"/>
+                <w:sz w:val="21"/>
+                <w:szCs w:val="21"/>
               </w:rPr>
               <w:t>CloudTrail Multi-Region Logging Disabled</w:t>
             </w:r>
@@ -1126,11 +1381,17 @@
             <w:pPr>
               <w:pStyle w:val="Compact"/>
               <w:spacing w:before="0" w:after="0" w:line="252" w:lineRule="auto"/>
+              <w:rPr>
+                <w:rFonts w:ascii="Century" w:hAnsi="Century" w:eastAsia="Century" w:cs="Century"/>
+                <w:sz w:val="21"/>
+                <w:szCs w:val="21"/>
+              </w:rPr>
             </w:pPr>
             <w:r>
               <w:rPr>
-                <w:rFonts w:ascii="Arial" w:hAnsi="Arial"/>
-                <w:sz w:val="18"/>
+                <w:rFonts w:ascii="Century" w:hAnsi="Century" w:eastAsia="Century" w:cs="Century"/>
+                <w:sz w:val="21"/>
+                <w:szCs w:val="21"/>
               </w:rPr>
               <w:t>Severity</w:t>
             </w:r>
@@ -1151,11 +1412,17 @@
             <w:pPr>
               <w:pStyle w:val="Compact"/>
               <w:spacing w:before="0" w:after="0" w:line="252" w:lineRule="auto"/>
+              <w:rPr>
+                <w:rFonts w:ascii="Century" w:hAnsi="Century" w:eastAsia="Century" w:cs="Century"/>
+                <w:sz w:val="21"/>
+                <w:szCs w:val="21"/>
+              </w:rPr>
             </w:pPr>
             <w:r>
               <w:rPr>
-                <w:rFonts w:ascii="Arial" w:hAnsi="Arial"/>
-                <w:sz w:val="18"/>
+                <w:rFonts w:ascii="Century" w:hAnsi="Century" w:eastAsia="Century" w:cs="Century"/>
+                <w:sz w:val="21"/>
+                <w:szCs w:val="21"/>
               </w:rPr>
               <w:t>High</w:t>
             </w:r>
@@ -1178,11 +1445,17 @@
             <w:pPr>
               <w:pStyle w:val="Compact"/>
               <w:spacing w:before="0" w:after="0" w:line="252" w:lineRule="auto"/>
+              <w:rPr>
+                <w:rFonts w:ascii="Century" w:hAnsi="Century" w:eastAsia="Century" w:cs="Century"/>
+                <w:sz w:val="21"/>
+                <w:szCs w:val="21"/>
+              </w:rPr>
             </w:pPr>
             <w:r>
               <w:rPr>
-                <w:rFonts w:ascii="Arial" w:hAnsi="Arial"/>
-                <w:sz w:val="18"/>
+                <w:rFonts w:ascii="Century" w:hAnsi="Century" w:eastAsia="Century" w:cs="Century"/>
+                <w:sz w:val="21"/>
+                <w:szCs w:val="21"/>
               </w:rPr>
               <w:t>Priority</w:t>
             </w:r>
@@ -1204,23 +1477,27 @@
               <w:pStyle w:val="Compact"/>
               <w:spacing w:before="0" w:after="0" w:line="252" w:lineRule="auto"/>
               <w:rPr>
-                <w:rFonts w:eastAsia="DengXian" w:hint="eastAsia"/>
+                <w:rFonts w:eastAsia="Century" w:hint="eastAsia" w:ascii="Century" w:hAnsi="Century" w:cs="Century"/>
                 <w:lang w:eastAsia="zh-CN"/>
+                <w:sz w:val="21"/>
+                <w:szCs w:val="21"/>
               </w:rPr>
             </w:pPr>
             <w:r>
               <w:rPr>
-                <w:rFonts w:ascii="Arial" w:eastAsia="DengXian" w:hAnsi="Arial" w:hint="eastAsia"/>
-                <w:sz w:val="18"/>
+                <w:rFonts w:ascii="Century" w:eastAsia="Century" w:hAnsi="Century" w:hint="eastAsia" w:cs="Century"/>
+                <w:sz w:val="21"/>
                 <w:lang w:eastAsia="zh-CN"/>
+                <w:szCs w:val="21"/>
               </w:rPr>
               <w:t>P</w:t>
             </w:r>
             <w:r>
               <w:rPr>
-                <w:rFonts w:eastAsia="DengXian" w:hint="eastAsia" w:ascii="Arial" w:hAnsi="Arial"/>
-                <w:sz w:val="18"/>
+                <w:rFonts w:eastAsia="Century" w:hint="eastAsia" w:ascii="Century" w:hAnsi="Century" w:cs="Century"/>
+                <w:sz w:val="21"/>
                 <w:lang w:eastAsia="zh-CN"/>
+                <w:szCs w:val="21"/>
               </w:rPr>
               <w:t>1</w:t>
             </w:r>
@@ -1243,11 +1520,17 @@
             <w:pPr>
               <w:pStyle w:val="Compact"/>
               <w:spacing w:before="0" w:after="0" w:line="252" w:lineRule="auto"/>
+              <w:rPr>
+                <w:rFonts w:ascii="Century" w:hAnsi="Century" w:eastAsia="Century" w:cs="Century"/>
+                <w:sz w:val="21"/>
+                <w:szCs w:val="21"/>
+              </w:rPr>
             </w:pPr>
             <w:r>
               <w:rPr>
-                <w:rFonts w:ascii="Arial" w:hAnsi="Arial"/>
-                <w:sz w:val="18"/>
+                <w:rFonts w:ascii="Century" w:hAnsi="Century" w:eastAsia="Century" w:cs="Century"/>
+                <w:sz w:val="21"/>
+                <w:szCs w:val="21"/>
               </w:rPr>
               <w:t>Risk Score</w:t>
             </w:r>
@@ -1269,15 +1552,18 @@
               <w:pStyle w:val="Compact"/>
               <w:spacing w:before="0" w:after="0" w:line="252" w:lineRule="auto"/>
               <w:rPr>
-                <w:rFonts w:eastAsia="DengXian" w:hint="eastAsia"/>
+                <w:rFonts w:eastAsia="Century" w:hint="eastAsia" w:ascii="Century" w:hAnsi="Century" w:cs="Century"/>
                 <w:lang w:eastAsia="zh-CN"/>
+                <w:sz w:val="21"/>
+                <w:szCs w:val="21"/>
               </w:rPr>
             </w:pPr>
             <w:r>
               <w:rPr>
-                <w:rFonts w:eastAsia="DengXian" w:hint="eastAsia" w:ascii="Arial" w:hAnsi="Arial"/>
-                <w:sz w:val="18"/>
+                <w:rFonts w:eastAsia="Century" w:hint="eastAsia" w:ascii="Century" w:hAnsi="Century" w:cs="Century"/>
+                <w:sz w:val="21"/>
                 <w:lang w:eastAsia="zh-CN"/>
+                <w:szCs w:val="21"/>
               </w:rPr>
               <w:t>85</w:t>
             </w:r>
@@ -1300,11 +1586,17 @@
             <w:pPr>
               <w:pStyle w:val="Compact"/>
               <w:spacing w:before="0" w:after="0" w:line="252" w:lineRule="auto"/>
+              <w:rPr>
+                <w:rFonts w:ascii="Century" w:hAnsi="Century" w:eastAsia="Century" w:cs="Century"/>
+                <w:sz w:val="21"/>
+                <w:szCs w:val="21"/>
+              </w:rPr>
             </w:pPr>
             <w:r>
               <w:rPr>
-                <w:rFonts w:ascii="Arial" w:hAnsi="Arial"/>
-                <w:sz w:val="18"/>
+                <w:rFonts w:ascii="Century" w:hAnsi="Century" w:eastAsia="Century" w:cs="Century"/>
+                <w:sz w:val="21"/>
+                <w:szCs w:val="21"/>
               </w:rPr>
               <w:t>Category</w:t>
             </w:r>
@@ -1325,12 +1617,18 @@
             <w:pPr>
               <w:pStyle w:val="Compact"/>
               <w:spacing w:before="0" w:after="0" w:line="252" w:lineRule="auto"/>
+              <w:rPr>
+                <w:rFonts w:ascii="Century" w:hAnsi="Century" w:eastAsia="Century" w:cs="Century"/>
+                <w:sz w:val="21"/>
+                <w:szCs w:val="21"/>
+              </w:rPr>
             </w:pPr>
             <w:r>
               <w:rPr>
-                <w:rFonts w:ascii="Arial" w:eastAsia="DengXian" w:hAnsi="Arial" w:hint="eastAsia"/>
-                <w:sz w:val="18"/>
+                <w:rFonts w:ascii="Century" w:eastAsia="Century" w:hAnsi="Century" w:hint="eastAsia" w:cs="Century"/>
+                <w:sz w:val="21"/>
                 <w:lang w:eastAsia="zh-CN"/>
+                <w:szCs w:val="21"/>
               </w:rPr>
               <w:t>Logging</w:t>
             </w:r>
@@ -1353,11 +1651,17 @@
             <w:pPr>
               <w:pStyle w:val="Compact"/>
               <w:spacing w:before="0" w:after="0" w:line="252" w:lineRule="auto"/>
+              <w:rPr>
+                <w:rFonts w:ascii="Century" w:hAnsi="Century" w:eastAsia="Century" w:cs="Century"/>
+                <w:sz w:val="21"/>
+                <w:szCs w:val="21"/>
+              </w:rPr>
             </w:pPr>
             <w:r>
               <w:rPr>
-                <w:rFonts w:ascii="Arial" w:hAnsi="Arial"/>
-                <w:sz w:val="18"/>
+                <w:rFonts w:ascii="Century" w:hAnsi="Century" w:eastAsia="Century" w:cs="Century"/>
+                <w:sz w:val="21"/>
+                <w:szCs w:val="21"/>
               </w:rPr>
               <w:t>Service</w:t>
             </w:r>
@@ -1378,11 +1682,17 @@
             <w:pPr>
               <w:pStyle w:val="Compact"/>
               <w:spacing w:before="0" w:after="0" w:line="252" w:lineRule="auto"/>
+              <w:rPr>
+                <w:rFonts w:ascii="Century" w:hAnsi="Century" w:eastAsia="Century" w:cs="Century"/>
+                <w:sz w:val="21"/>
+                <w:szCs w:val="21"/>
+              </w:rPr>
             </w:pPr>
             <w:r>
               <w:rPr>
-                <w:rFonts w:ascii="Arial" w:hAnsi="Arial"/>
-                <w:sz w:val="18"/>
+                <w:rFonts w:ascii="Century" w:hAnsi="Century" w:eastAsia="Century" w:cs="Century"/>
+                <w:sz w:val="21"/>
+                <w:szCs w:val="21"/>
               </w:rPr>
               <w:t>CloudTrail</w:t>
             </w:r>
@@ -1405,11 +1715,17 @@
             <w:pPr>
               <w:pStyle w:val="Compact"/>
               <w:spacing w:before="0" w:after="0" w:line="252" w:lineRule="auto"/>
+              <w:rPr>
+                <w:rFonts w:ascii="Century" w:hAnsi="Century" w:eastAsia="Century" w:cs="Century"/>
+                <w:sz w:val="21"/>
+                <w:szCs w:val="21"/>
+              </w:rPr>
             </w:pPr>
             <w:r>
               <w:rPr>
-                <w:rFonts w:ascii="Arial" w:hAnsi="Arial"/>
-                <w:sz w:val="18"/>
+                <w:rFonts w:ascii="Century" w:hAnsi="Century" w:eastAsia="Century" w:cs="Century"/>
+                <w:sz w:val="21"/>
+                <w:szCs w:val="21"/>
               </w:rPr>
               <w:t>Status</w:t>
             </w:r>
@@ -1430,11 +1746,17 @@
             <w:pPr>
               <w:pStyle w:val="Compact"/>
               <w:spacing w:before="0" w:after="0" w:line="252" w:lineRule="auto"/>
+              <w:rPr>
+                <w:rFonts w:ascii="Century" w:hAnsi="Century" w:eastAsia="Century" w:cs="Century"/>
+                <w:sz w:val="21"/>
+                <w:szCs w:val="21"/>
+              </w:rPr>
             </w:pPr>
             <w:r>
               <w:rPr>
-                <w:rFonts w:ascii="Arial" w:hAnsi="Arial"/>
-                <w:sz w:val="18"/>
+                <w:rFonts w:ascii="Century" w:hAnsi="Century" w:eastAsia="Century" w:cs="Century"/>
+                <w:sz w:val="21"/>
+                <w:szCs w:val="21"/>
               </w:rPr>
               <w:t>Open</w:t>
             </w:r>
@@ -1457,11 +1779,17 @@
             <w:pPr>
               <w:pStyle w:val="Compact"/>
               <w:spacing w:before="0" w:after="0" w:line="252" w:lineRule="auto"/>
+              <w:rPr>
+                <w:rFonts w:ascii="Century" w:hAnsi="Century" w:eastAsia="Century" w:cs="Century"/>
+                <w:sz w:val="21"/>
+                <w:szCs w:val="21"/>
+              </w:rPr>
             </w:pPr>
             <w:r>
               <w:rPr>
-                <w:rFonts w:ascii="Arial" w:hAnsi="Arial"/>
-                <w:sz w:val="18"/>
+                <w:rFonts w:ascii="Century" w:hAnsi="Century" w:eastAsia="Century" w:cs="Century"/>
+                <w:sz w:val="21"/>
+                <w:szCs w:val="21"/>
               </w:rPr>
               <w:t>First Seen</w:t>
             </w:r>
@@ -1482,11 +1810,17 @@
             <w:pPr>
               <w:pStyle w:val="Compact"/>
               <w:spacing w:before="0" w:after="0" w:line="252" w:lineRule="auto"/>
+              <w:rPr>
+                <w:rFonts w:ascii="Century" w:hAnsi="Century" w:eastAsia="Century" w:cs="Century"/>
+                <w:sz w:val="21"/>
+                <w:szCs w:val="21"/>
+              </w:rPr>
             </w:pPr>
             <w:r>
               <w:rPr>
-                <w:rFonts w:ascii="Arial" w:hAnsi="Arial"/>
-                <w:sz w:val="18"/>
+                <w:rFonts w:ascii="Century" w:hAnsi="Century" w:eastAsia="Century" w:cs="Century"/>
+                <w:sz w:val="21"/>
+                <w:szCs w:val="21"/>
               </w:rPr>
               <w:t>2026-06-10</w:t>
             </w:r>
@@ -1509,11 +1843,17 @@
             <w:pPr>
               <w:pStyle w:val="Compact"/>
               <w:spacing w:before="0" w:after="0" w:line="252" w:lineRule="auto"/>
+              <w:rPr>
+                <w:rFonts w:ascii="Century" w:hAnsi="Century" w:eastAsia="Century" w:cs="Century"/>
+                <w:sz w:val="21"/>
+                <w:szCs w:val="21"/>
+              </w:rPr>
             </w:pPr>
             <w:r>
               <w:rPr>
-                <w:rFonts w:ascii="Arial" w:hAnsi="Arial"/>
-                <w:sz w:val="18"/>
+                <w:rFonts w:ascii="Century" w:hAnsi="Century" w:eastAsia="Century" w:cs="Century"/>
+                <w:sz w:val="21"/>
+                <w:szCs w:val="21"/>
               </w:rPr>
               <w:t>Last Seen</w:t>
             </w:r>
@@ -1534,11 +1874,17 @@
             <w:pPr>
               <w:pStyle w:val="Compact"/>
               <w:spacing w:before="0" w:after="0" w:line="252" w:lineRule="auto"/>
+              <w:rPr>
+                <w:rFonts w:ascii="Century" w:hAnsi="Century" w:eastAsia="Century" w:cs="Century"/>
+                <w:sz w:val="21"/>
+                <w:szCs w:val="21"/>
+              </w:rPr>
             </w:pPr>
             <w:r>
               <w:rPr>
-                <w:rFonts w:ascii="Arial" w:hAnsi="Arial"/>
-                <w:sz w:val="18"/>
+                <w:rFonts w:ascii="Century" w:hAnsi="Century" w:eastAsia="Century" w:cs="Century"/>
+                <w:sz w:val="21"/>
+                <w:szCs w:val="21"/>
               </w:rPr>
               <w:t>2026-06-10</w:t>
             </w:r>
@@ -1546,21 +1892,35 @@
         </w:tc>
       </w:tr>
     </w:tbl>
-    <w:p/>
+    <w:p>
+      <w:pPr>
+        <w:rPr>
+          <w:rFonts w:ascii="Century" w:hAnsi="Century" w:eastAsia="Century" w:cs="Century"/>
+          <w:sz w:val="21"/>
+          <w:szCs w:val="21"/>
+        </w:rPr>
+      </w:pPr>
+    </w:p>
     <w:p>
       <w:pPr>
         <w:pStyle w:val="3"/>
         <w:spacing w:before="160" w:after="100" w:line="252" w:lineRule="auto"/>
+        <w:rPr>
+          <w:rFonts w:ascii="Century" w:hAnsi="Century" w:eastAsia="Century" w:cs="Century"/>
+          <w:sz w:val="24"/>
+          <w:szCs w:val="24"/>
+        </w:rPr>
       </w:pPr>
       <w:bookmarkStart w:id="16" w:name="executive-summary"/>
       <w:bookmarkStart w:id="17" w:name="_Toc232007596"/>
       <w:bookmarkEnd w:id="14"/>
       <w:r>
         <w:rPr>
-          <w:rFonts w:ascii="Arial" w:hAnsi="Arial" w:eastAsia="PingFang SC"/>
+          <w:rFonts w:ascii="Century" w:hAnsi="Century" w:eastAsia="Century" w:cs="Century"/>
           <w:b/>
           <w:color w:val="0F4C5C"/>
           <w:sz w:val="24"/>
+          <w:szCs w:val="24"/>
         </w:rPr>
         <w:t>2.1.2 Executive Summary</w:t>
       </w:r>
@@ -1569,19 +1929,28 @@
     <w:p>
       <w:pPr>
         <w:rPr>
-          <w:rFonts w:eastAsia="DengXian"/>
+          <w:rFonts w:eastAsia="Century" w:ascii="Century" w:hAnsi="Century" w:cs="Century"/>
           <w:lang w:eastAsia="zh-CN"/>
+          <w:sz w:val="21"/>
+          <w:szCs w:val="21"/>
         </w:rPr>
       </w:pPr>
       <w:r>
+        <w:rPr>
+          <w:rFonts w:ascii="Century" w:hAnsi="Century" w:eastAsia="Century" w:cs="Century"/>
+          <w:sz w:val="21"/>
+          <w:szCs w:val="21"/>
+        </w:rPr>
         <w:t>CloudTrail logging is not enabled across all AWS regions. This creates visibility gaps that may allow malicious activities to occur without sufficient audit evidence, reducing detection and forensic capabilities.</w:t>
       </w:r>
     </w:p>
     <w:p>
       <w:pPr>
         <w:rPr>
-          <w:rFonts w:eastAsia="DengXian" w:hint="eastAsia"/>
+          <w:rFonts w:eastAsia="Century" w:hint="eastAsia" w:ascii="Century" w:hAnsi="Century" w:cs="Century"/>
           <w:lang w:eastAsia="zh-CN"/>
+          <w:sz w:val="21"/>
+          <w:szCs w:val="21"/>
         </w:rPr>
       </w:pPr>
     </w:p>
@@ -1589,13 +1958,19 @@
       <w:pPr>
         <w:pStyle w:val="3"/>
         <w:spacing w:before="160" w:after="100" w:line="252" w:lineRule="auto"/>
+        <w:rPr>
+          <w:rFonts w:ascii="Century" w:hAnsi="Century" w:eastAsia="Century" w:cs="Century"/>
+          <w:sz w:val="24"/>
+          <w:szCs w:val="24"/>
+        </w:rPr>
       </w:pPr>
       <w:r>
         <w:rPr>
-          <w:rFonts w:ascii="Arial" w:hAnsi="Arial" w:eastAsia="PingFang SC"/>
+          <w:rFonts w:ascii="Century" w:hAnsi="Century" w:eastAsia="Century" w:cs="Century"/>
           <w:b/>
           <w:color w:val="0F4C5C"/>
           <w:sz w:val="24"/>
+          <w:szCs w:val="24"/>
         </w:rPr>
         <w:t>2.1.3 Affected Resources</w:t>
       </w:r>
@@ -1606,13 +1981,19 @@
         <w:spacing w:before="120" w:after="120"/>
         <w:ind w:left="0" w:firstLine="0"/>
         <w:jc w:val="center"/>
+        <w:rPr>
+          <w:rFonts w:ascii="Century" w:hAnsi="Century" w:eastAsia="Century" w:cs="Century"/>
+          <w:sz w:val="21"/>
+          <w:szCs w:val="21"/>
+        </w:rPr>
       </w:pPr>
       <w:r>
         <w:rPr>
-          <w:rFonts w:ascii="Arial" w:hAnsi="Arial"/>
+          <w:rFonts w:ascii="Century" w:hAnsi="Century" w:eastAsia="Century" w:cs="Century"/>
           <w:b/>
           <w:bCs/>
           <w:sz w:val="21"/>
+          <w:szCs w:val="21"/>
         </w:rPr>
         <w:t>Table 2-2 Affected Resources</w:t>
       </w:r>
@@ -1665,13 +2046,19 @@
             <w:pPr>
               <w:pStyle w:val="Compact"/>
               <w:spacing w:before="0" w:after="0" w:line="252" w:lineRule="auto"/>
+              <w:rPr>
+                <w:rFonts w:ascii="Century" w:hAnsi="Century" w:eastAsia="Century" w:cs="Century"/>
+                <w:sz w:val="21"/>
+                <w:szCs w:val="21"/>
+              </w:rPr>
             </w:pPr>
             <w:r>
               <w:rPr>
-                <w:rFonts w:ascii="Arial" w:hAnsi="Arial"/>
+                <w:rFonts w:ascii="Century" w:hAnsi="Century" w:eastAsia="Century" w:cs="Century"/>
                 <w:b/>
                 <w:color w:val="FFFFFF"/>
-                <w:sz w:val="18"/>
+                <w:sz w:val="21"/>
+                <w:szCs w:val="21"/>
               </w:rPr>
               <w:t>Resource Name</w:t>
             </w:r>
@@ -1696,13 +2083,19 @@
             <w:pPr>
               <w:pStyle w:val="Compact"/>
               <w:spacing w:before="0" w:after="0" w:line="252" w:lineRule="auto"/>
+              <w:rPr>
+                <w:rFonts w:ascii="Century" w:hAnsi="Century" w:eastAsia="Century" w:cs="Century"/>
+                <w:sz w:val="21"/>
+                <w:szCs w:val="21"/>
+              </w:rPr>
             </w:pPr>
             <w:r>
               <w:rPr>
-                <w:rFonts w:ascii="Arial" w:hAnsi="Arial"/>
+                <w:rFonts w:ascii="Century" w:hAnsi="Century" w:eastAsia="Century" w:cs="Century"/>
                 <w:b/>
                 <w:color w:val="FFFFFF"/>
-                <w:sz w:val="18"/>
+                <w:sz w:val="21"/>
+                <w:szCs w:val="21"/>
               </w:rPr>
               <w:t>Resource Type</w:t>
             </w:r>
@@ -1727,13 +2120,19 @@
             <w:pPr>
               <w:pStyle w:val="Compact"/>
               <w:spacing w:before="0" w:after="0" w:line="252" w:lineRule="auto"/>
+              <w:rPr>
+                <w:rFonts w:ascii="Century" w:hAnsi="Century" w:eastAsia="Century" w:cs="Century"/>
+                <w:sz w:val="21"/>
+                <w:szCs w:val="21"/>
+              </w:rPr>
             </w:pPr>
             <w:r>
               <w:rPr>
-                <w:rFonts w:ascii="Arial" w:hAnsi="Arial"/>
+                <w:rFonts w:ascii="Century" w:hAnsi="Century" w:eastAsia="Century" w:cs="Century"/>
                 <w:b/>
                 <w:color w:val="FFFFFF"/>
-                <w:sz w:val="18"/>
+                <w:sz w:val="21"/>
+                <w:szCs w:val="21"/>
               </w:rPr>
               <w:t>Region</w:t>
             </w:r>
@@ -1758,13 +2157,19 @@
             <w:pPr>
               <w:pStyle w:val="Compact"/>
               <w:spacing w:before="0" w:after="0" w:line="252" w:lineRule="auto"/>
+              <w:rPr>
+                <w:rFonts w:ascii="Century" w:hAnsi="Century" w:eastAsia="Century" w:cs="Century"/>
+                <w:sz w:val="21"/>
+                <w:szCs w:val="21"/>
+              </w:rPr>
             </w:pPr>
             <w:r>
               <w:rPr>
-                <w:rFonts w:ascii="Arial" w:hAnsi="Arial"/>
+                <w:rFonts w:ascii="Century" w:hAnsi="Century" w:eastAsia="Century" w:cs="Century"/>
                 <w:b/>
                 <w:color w:val="FFFFFF"/>
-                <w:sz w:val="18"/>
+                <w:sz w:val="21"/>
+                <w:szCs w:val="21"/>
               </w:rPr>
               <w:t>Environment</w:t>
             </w:r>
@@ -1789,13 +2194,19 @@
             <w:pPr>
               <w:pStyle w:val="Compact"/>
               <w:spacing w:before="0" w:after="0" w:line="252" w:lineRule="auto"/>
+              <w:rPr>
+                <w:rFonts w:ascii="Century" w:hAnsi="Century" w:eastAsia="Century" w:cs="Century"/>
+                <w:sz w:val="21"/>
+                <w:szCs w:val="21"/>
+              </w:rPr>
             </w:pPr>
             <w:r>
               <w:rPr>
-                <w:rFonts w:ascii="Arial" w:hAnsi="Arial"/>
+                <w:rFonts w:ascii="Century" w:hAnsi="Century" w:eastAsia="Century" w:cs="Century"/>
                 <w:b/>
                 <w:color w:val="FFFFFF"/>
-                <w:sz w:val="18"/>
+                <w:sz w:val="21"/>
+                <w:szCs w:val="21"/>
               </w:rPr>
               <w:t>Owner</w:t>
             </w:r>
@@ -1825,11 +2236,17 @@
             <w:pPr>
               <w:pStyle w:val="Compact"/>
               <w:spacing w:before="0" w:after="0" w:line="252" w:lineRule="auto"/>
+              <w:rPr>
+                <w:rFonts w:ascii="Century" w:hAnsi="Century" w:eastAsia="Century" w:cs="Century"/>
+                <w:sz w:val="21"/>
+                <w:szCs w:val="21"/>
+              </w:rPr>
             </w:pPr>
             <w:r>
               <w:rPr>
-                <w:rFonts w:ascii="Arial" w:hAnsi="Arial"/>
-                <w:sz w:val="18"/>
+                <w:rFonts w:ascii="Century" w:hAnsi="Century" w:eastAsia="Century" w:cs="Century"/>
+                <w:sz w:val="21"/>
+                <w:szCs w:val="21"/>
               </w:rPr>
               <w:t>AWS Account</w:t>
             </w:r>
@@ -1853,12 +2270,18 @@
             <w:pPr>
               <w:pStyle w:val="Compact"/>
               <w:spacing w:before="0" w:after="0" w:line="252" w:lineRule="auto"/>
+              <w:rPr>
+                <w:rFonts w:ascii="Century" w:hAnsi="Century" w:eastAsia="Century" w:cs="Century"/>
+                <w:sz w:val="21"/>
+                <w:szCs w:val="21"/>
+              </w:rPr>
             </w:pPr>
             <w:proofErr w:type="spellStart"/>
             <w:r>
               <w:rPr>
-                <w:rFonts w:ascii="Arial" w:hAnsi="Arial"/>
-                <w:sz w:val="18"/>
+                <w:rFonts w:ascii="Century" w:hAnsi="Century" w:eastAsia="Century" w:cs="Century"/>
+                <w:sz w:val="21"/>
+                <w:szCs w:val="21"/>
               </w:rPr>
               <w:t>AwsCloudTrailTrail</w:t>
             </w:r>
@@ -1883,11 +2306,17 @@
             <w:pPr>
               <w:pStyle w:val="Compact"/>
               <w:spacing w:before="0" w:after="0" w:line="252" w:lineRule="auto"/>
+              <w:rPr>
+                <w:rFonts w:ascii="Century" w:hAnsi="Century" w:eastAsia="Century" w:cs="Century"/>
+                <w:sz w:val="21"/>
+                <w:szCs w:val="21"/>
+              </w:rPr>
             </w:pPr>
             <w:r>
               <w:rPr>
-                <w:rFonts w:ascii="Arial" w:hAnsi="Arial"/>
-                <w:sz w:val="18"/>
+                <w:rFonts w:ascii="Century" w:hAnsi="Century" w:eastAsia="Century" w:cs="Century"/>
+                <w:sz w:val="21"/>
+                <w:szCs w:val="21"/>
               </w:rPr>
               <w:t>us-east-1</w:t>
             </w:r>
@@ -1911,11 +2340,17 @@
             <w:pPr>
               <w:pStyle w:val="Compact"/>
               <w:spacing w:before="0" w:after="0" w:line="252" w:lineRule="auto"/>
+              <w:rPr>
+                <w:rFonts w:ascii="Century" w:hAnsi="Century" w:eastAsia="Century" w:cs="Century"/>
+                <w:sz w:val="21"/>
+                <w:szCs w:val="21"/>
+              </w:rPr>
             </w:pPr>
             <w:r>
               <w:rPr>
-                <w:rFonts w:ascii="Arial" w:hAnsi="Arial"/>
-                <w:sz w:val="18"/>
+                <w:rFonts w:ascii="Century" w:hAnsi="Century" w:eastAsia="Century" w:cs="Century"/>
+                <w:sz w:val="21"/>
+                <w:szCs w:val="21"/>
               </w:rPr>
               <w:t>Production</w:t>
             </w:r>
@@ -1939,11 +2374,17 @@
             <w:pPr>
               <w:pStyle w:val="Compact"/>
               <w:spacing w:before="0" w:after="0" w:line="252" w:lineRule="auto"/>
+              <w:rPr>
+                <w:rFonts w:ascii="Century" w:hAnsi="Century" w:eastAsia="Century" w:cs="Century"/>
+                <w:sz w:val="21"/>
+                <w:szCs w:val="21"/>
+              </w:rPr>
             </w:pPr>
             <w:r>
               <w:rPr>
-                <w:rFonts w:ascii="Arial" w:hAnsi="Arial"/>
-                <w:sz w:val="18"/>
+                <w:rFonts w:ascii="Century" w:hAnsi="Century" w:eastAsia="Century" w:cs="Century"/>
+                <w:sz w:val="21"/>
+                <w:szCs w:val="21"/>
               </w:rPr>
               <w:t>Cloud Team</w:t>
             </w:r>
@@ -1951,18 +2392,32 @@
         </w:tc>
       </w:tr>
     </w:tbl>
-    <w:p/>
+    <w:p>
+      <w:pPr>
+        <w:rPr>
+          <w:rFonts w:ascii="Century" w:hAnsi="Century" w:eastAsia="Century" w:cs="Century"/>
+          <w:sz w:val="21"/>
+          <w:szCs w:val="21"/>
+        </w:rPr>
+      </w:pPr>
+    </w:p>
     <w:p>
       <w:pPr>
         <w:pStyle w:val="3"/>
         <w:spacing w:before="160" w:after="100" w:line="252" w:lineRule="auto"/>
+        <w:rPr>
+          <w:rFonts w:ascii="Century" w:hAnsi="Century" w:eastAsia="Century" w:cs="Century"/>
+          <w:sz w:val="24"/>
+          <w:szCs w:val="24"/>
+        </w:rPr>
       </w:pPr>
       <w:r>
         <w:rPr>
-          <w:rFonts w:ascii="Arial" w:hAnsi="Arial" w:eastAsia="PingFang SC"/>
+          <w:rFonts w:ascii="Century" w:hAnsi="Century" w:eastAsia="Century" w:cs="Century"/>
           <w:b/>
           <w:color w:val="0F4C5C"/>
           <w:sz w:val="24"/>
+          <w:szCs w:val="24"/>
         </w:rPr>
         <w:t>2.1.4 Remediation Guidance</w:t>
       </w:r>
@@ -1971,15 +2426,21 @@
       <w:pPr>
         <w:pStyle w:val="3"/>
         <w:spacing w:before="160" w:after="100" w:line="252" w:lineRule="auto"/>
+        <w:rPr>
+          <w:rFonts w:ascii="Century" w:hAnsi="Century" w:eastAsia="Century" w:cs="Century"/>
+          <w:sz w:val="21"/>
+          <w:szCs w:val="21"/>
+        </w:rPr>
       </w:pPr>
       <w:bookmarkStart w:id="34" w:name="recommended-actions"/>
       <w:bookmarkStart w:id="35" w:name="_Toc232007605"/>
       <w:r>
         <w:rPr>
-          <w:rFonts w:ascii="Arial" w:hAnsi="Arial" w:eastAsia="PingFang SC"/>
+          <w:rFonts w:ascii="Century" w:hAnsi="Century" w:eastAsia="Century" w:cs="Century"/>
           <w:b/>
           <w:color w:val="0F4C5C"/>
-          <w:sz w:val="24"/>
+          <w:sz w:val="21"/>
+          <w:szCs w:val="21"/>
         </w:rPr>
         <w:t>Recommended Actions</w:t>
       </w:r>
@@ -1993,8 +2454,18 @@
           <w:numId w:val="5"/>
         </w:numPr>
         <w:ind w:leftChars="0"/>
+        <w:rPr>
+          <w:rFonts w:ascii="Century" w:hAnsi="Century" w:eastAsia="Century" w:cs="Century"/>
+          <w:sz w:val="21"/>
+          <w:szCs w:val="21"/>
+        </w:rPr>
       </w:pPr>
       <w:r>
+        <w:rPr>
+          <w:rFonts w:ascii="Century" w:hAnsi="Century" w:eastAsia="Century" w:cs="Century"/>
+          <w:sz w:val="21"/>
+          <w:szCs w:val="21"/>
+        </w:rPr>
         <w:t>Enable CloudTrail.</w:t>
       </w:r>
     </w:p>
@@ -2006,8 +2477,18 @@
           <w:numId w:val="5"/>
         </w:numPr>
         <w:ind w:leftChars="0"/>
+        <w:rPr>
+          <w:rFonts w:ascii="Century" w:hAnsi="Century" w:eastAsia="Century" w:cs="Century"/>
+          <w:sz w:val="21"/>
+          <w:szCs w:val="21"/>
+        </w:rPr>
       </w:pPr>
       <w:r>
+        <w:rPr>
+          <w:rFonts w:ascii="Century" w:hAnsi="Century" w:eastAsia="Century" w:cs="Century"/>
+          <w:sz w:val="21"/>
+          <w:szCs w:val="21"/>
+        </w:rPr>
         <w:t>Enable multi-region logging.</w:t>
       </w:r>
     </w:p>
@@ -2019,8 +2500,18 @@
           <w:numId w:val="5"/>
         </w:numPr>
         <w:ind w:leftChars="0"/>
+        <w:rPr>
+          <w:rFonts w:ascii="Century" w:hAnsi="Century" w:eastAsia="Century" w:cs="Century"/>
+          <w:sz w:val="21"/>
+          <w:szCs w:val="21"/>
+        </w:rPr>
       </w:pPr>
       <w:r>
+        <w:rPr>
+          <w:rFonts w:ascii="Century" w:hAnsi="Century" w:eastAsia="Century" w:cs="Century"/>
+          <w:sz w:val="21"/>
+          <w:szCs w:val="21"/>
+        </w:rPr>
         <w:t>Store logs centrally in S3.</w:t>
       </w:r>
     </w:p>
@@ -2033,27 +2524,48 @@
         </w:numPr>
         <w:ind w:leftChars="0"/>
         <w:rPr>
-          <w:rFonts w:hint="eastAsia"/>
+          <w:rFonts w:hint="eastAsia" w:ascii="Century" w:hAnsi="Century" w:eastAsia="Century" w:cs="Century"/>
+          <w:sz w:val="21"/>
+          <w:szCs w:val="21"/>
         </w:rPr>
       </w:pPr>
       <w:r>
+        <w:rPr>
+          <w:rFonts w:ascii="Century" w:hAnsi="Century" w:eastAsia="Century" w:cs="Century"/>
+          <w:sz w:val="21"/>
+          <w:szCs w:val="21"/>
+        </w:rPr>
         <w:t>Configure log monitoring alerts.</w:t>
       </w:r>
       <w:bookmarkStart w:id="36" w:name="cloudformation"/>
       <w:bookmarkEnd w:id="34"/>
     </w:p>
-    <w:p/>
+    <w:p>
+      <w:pPr>
+        <w:rPr>
+          <w:rFonts w:ascii="Century" w:hAnsi="Century" w:eastAsia="Century" w:cs="Century"/>
+          <w:sz w:val="21"/>
+          <w:szCs w:val="21"/>
+        </w:rPr>
+      </w:pPr>
+    </w:p>
     <w:p>
       <w:pPr>
         <w:pStyle w:val="3"/>
         <w:spacing w:before="160" w:after="100" w:line="252" w:lineRule="auto"/>
+        <w:rPr>
+          <w:rFonts w:ascii="Century" w:hAnsi="Century" w:eastAsia="Century" w:cs="Century"/>
+          <w:sz w:val="24"/>
+          <w:szCs w:val="24"/>
+        </w:rPr>
       </w:pPr>
       <w:r>
         <w:rPr>
-          <w:rFonts w:ascii="Arial" w:hAnsi="Arial" w:eastAsia="PingFang SC"/>
+          <w:rFonts w:ascii="Century" w:hAnsi="Century" w:eastAsia="Century" w:cs="Century"/>
           <w:b/>
           <w:color w:val="0F4C5C"/>
           <w:sz w:val="24"/>
+          <w:szCs w:val="24"/>
         </w:rPr>
         <w:t>2.1.5 References</w:t>
       </w:r>
@@ -2065,8 +2577,18 @@
           <w:ilvl w:val="0"/>
           <w:numId w:val="4"/>
         </w:numPr>
+        <w:rPr>
+          <w:rFonts w:ascii="Century" w:hAnsi="Century" w:eastAsia="Century" w:cs="Century"/>
+          <w:sz w:val="21"/>
+          <w:szCs w:val="21"/>
+        </w:rPr>
       </w:pPr>
       <w:r>
+        <w:rPr>
+          <w:rFonts w:ascii="Century" w:hAnsi="Century" w:eastAsia="Century" w:cs="Century"/>
+          <w:sz w:val="21"/>
+          <w:szCs w:val="21"/>
+        </w:rPr>
         <w:t>AWS Documentation</w:t>
       </w:r>
     </w:p>
@@ -2077,8 +2599,18 @@
           <w:ilvl w:val="0"/>
           <w:numId w:val="4"/>
         </w:numPr>
+        <w:rPr>
+          <w:rFonts w:ascii="Century" w:hAnsi="Century" w:eastAsia="Century" w:cs="Century"/>
+          <w:sz w:val="21"/>
+          <w:szCs w:val="21"/>
+        </w:rPr>
       </w:pPr>
       <w:r>
+        <w:rPr>
+          <w:rFonts w:ascii="Century" w:hAnsi="Century" w:eastAsia="Century" w:cs="Century"/>
+          <w:sz w:val="21"/>
+          <w:szCs w:val="21"/>
+        </w:rPr>
         <w:t>CIS Benchmark</w:t>
       </w:r>
     </w:p>
@@ -2089,26 +2621,50 @@
           <w:ilvl w:val="0"/>
           <w:numId w:val="4"/>
         </w:numPr>
+        <w:rPr>
+          <w:rFonts w:ascii="Century" w:hAnsi="Century" w:eastAsia="Century" w:cs="Century"/>
+          <w:sz w:val="21"/>
+          <w:szCs w:val="21"/>
+        </w:rPr>
       </w:pPr>
       <w:r>
+        <w:rPr>
+          <w:rFonts w:ascii="Century" w:hAnsi="Century" w:eastAsia="Century" w:cs="Century"/>
+          <w:sz w:val="21"/>
+          <w:szCs w:val="21"/>
+        </w:rPr>
         <w:t>Vendor Guidance</w:t>
       </w:r>
     </w:p>
-    <w:p/>
+    <w:p>
+      <w:pPr>
+        <w:rPr>
+          <w:rFonts w:ascii="Century" w:hAnsi="Century" w:eastAsia="Century" w:cs="Century"/>
+          <w:sz w:val="21"/>
+          <w:szCs w:val="21"/>
+        </w:rPr>
+      </w:pPr>
+    </w:p>
     <w:p>
       <w:pPr>
         <w:pStyle w:val="1"/>
         <w:spacing w:before="160" w:after="100" w:line="252" w:lineRule="auto"/>
+        <w:rPr>
+          <w:rFonts w:ascii="Century" w:hAnsi="Century" w:eastAsia="Century" w:cs="Century"/>
+          <w:sz w:val="36"/>
+          <w:szCs w:val="36"/>
+        </w:rPr>
       </w:pPr>
       <w:bookmarkStart w:id="68" w:name="appendix-a.-severity-definitions"/>
       <w:bookmarkStart w:id="69" w:name="_Toc232007629"/>
       <w:bookmarkEnd w:id="67"/>
       <w:r>
         <w:rPr>
-          <w:rFonts w:ascii="Arial" w:hAnsi="Arial" w:eastAsia="PingFang SC"/>
+          <w:rFonts w:ascii="Century" w:hAnsi="Century" w:eastAsia="Century" w:cs="Century"/>
           <w:b/>
           <w:color w:val="0F4C5C"/>
-          <w:sz w:val="40"/>
+          <w:sz w:val="36"/>
+          <w:szCs w:val="36"/>
         </w:rPr>
         <w:lastRenderedPageBreak/>
         <w:t>Appendix A. Severity Definitions</w:t>
@@ -2121,13 +2677,19 @@
         <w:spacing w:before="120" w:after="120"/>
         <w:ind w:left="0" w:firstLine="0"/>
         <w:jc w:val="center"/>
+        <w:rPr>
+          <w:rFonts w:ascii="Century" w:hAnsi="Century" w:eastAsia="Century" w:cs="Century"/>
+          <w:sz w:val="21"/>
+          <w:szCs w:val="21"/>
+        </w:rPr>
       </w:pPr>
       <w:r>
         <w:rPr>
-          <w:rFonts w:ascii="Arial" w:hAnsi="Arial"/>
+          <w:rFonts w:ascii="Century" w:hAnsi="Century" w:eastAsia="Century" w:cs="Century"/>
           <w:b/>
           <w:bCs/>
           <w:sz w:val="21"/>
+          <w:szCs w:val="21"/>
         </w:rPr>
         <w:t>Table A-1 Severity Definitions</w:t>
       </w:r>
@@ -2166,13 +2728,19 @@
             <w:pPr>
               <w:pStyle w:val="Compact"/>
               <w:spacing w:before="0" w:after="0" w:line="252" w:lineRule="auto"/>
+              <w:rPr>
+                <w:rFonts w:ascii="Century" w:hAnsi="Century" w:eastAsia="Century" w:cs="Century"/>
+                <w:sz w:val="21"/>
+                <w:szCs w:val="21"/>
+              </w:rPr>
             </w:pPr>
             <w:r>
               <w:rPr>
-                <w:rFonts w:ascii="Arial" w:hAnsi="Arial"/>
+                <w:rFonts w:ascii="Century" w:hAnsi="Century" w:eastAsia="Century" w:cs="Century"/>
                 <w:b/>
                 <w:color w:val="FFFFFF"/>
-                <w:sz w:val="18"/>
+                <w:sz w:val="21"/>
+                <w:szCs w:val="21"/>
               </w:rPr>
               <w:t>Severity</w:t>
             </w:r>
@@ -2194,13 +2762,19 @@
             <w:pPr>
               <w:pStyle w:val="Compact"/>
               <w:spacing w:before="0" w:after="0" w:line="252" w:lineRule="auto"/>
+              <w:rPr>
+                <w:rFonts w:ascii="Century" w:hAnsi="Century" w:eastAsia="Century" w:cs="Century"/>
+                <w:sz w:val="21"/>
+                <w:szCs w:val="21"/>
+              </w:rPr>
             </w:pPr>
             <w:r>
               <w:rPr>
-                <w:rFonts w:ascii="Arial" w:hAnsi="Arial"/>
+                <w:rFonts w:ascii="Century" w:hAnsi="Century" w:eastAsia="Century" w:cs="Century"/>
                 <w:b/>
                 <w:color w:val="FFFFFF"/>
-                <w:sz w:val="18"/>
+                <w:sz w:val="21"/>
+                <w:szCs w:val="21"/>
               </w:rPr>
               <w:t>Description</w:t>
             </w:r>
@@ -2223,13 +2797,19 @@
             <w:pPr>
               <w:pStyle w:val="Compact"/>
               <w:spacing w:before="0" w:after="0" w:line="252" w:lineRule="auto"/>
+              <w:rPr>
+                <w:rFonts w:ascii="Century" w:hAnsi="Century" w:eastAsia="Century" w:cs="Century"/>
+                <w:sz w:val="21"/>
+                <w:szCs w:val="21"/>
+              </w:rPr>
             </w:pPr>
             <w:r>
               <w:rPr>
-                <w:rFonts w:ascii="Arial" w:hAnsi="Arial"/>
+                <w:rFonts w:ascii="Century" w:hAnsi="Century" w:eastAsia="Century" w:cs="Century"/>
                 <w:b/>
                 <w:color w:val="990000"/>
-                <w:sz w:val="18"/>
+                <w:sz w:val="21"/>
+                <w:szCs w:val="21"/>
               </w:rPr>
               <w:t>Critical</w:t>
             </w:r>
@@ -2250,11 +2830,17 @@
             <w:pPr>
               <w:pStyle w:val="Compact"/>
               <w:spacing w:before="0" w:after="0" w:line="252" w:lineRule="auto"/>
+              <w:rPr>
+                <w:rFonts w:ascii="Century" w:hAnsi="Century" w:eastAsia="Century" w:cs="Century"/>
+                <w:sz w:val="21"/>
+                <w:szCs w:val="21"/>
+              </w:rPr>
             </w:pPr>
             <w:r>
               <w:rPr>
-                <w:rFonts w:ascii="Arial" w:hAnsi="Arial"/>
-                <w:sz w:val="18"/>
+                <w:rFonts w:ascii="Century" w:hAnsi="Century" w:eastAsia="Century" w:cs="Century"/>
+                <w:sz w:val="21"/>
+                <w:szCs w:val="21"/>
               </w:rPr>
               <w:t>Immediate risk requiring urgent remediation</w:t>
             </w:r>
@@ -2277,13 +2863,19 @@
             <w:pPr>
               <w:pStyle w:val="Compact"/>
               <w:spacing w:before="0" w:after="0" w:line="252" w:lineRule="auto"/>
+              <w:rPr>
+                <w:rFonts w:ascii="Century" w:hAnsi="Century" w:eastAsia="Century" w:cs="Century"/>
+                <w:sz w:val="21"/>
+                <w:szCs w:val="21"/>
+              </w:rPr>
             </w:pPr>
             <w:r>
               <w:rPr>
-                <w:rFonts w:ascii="Arial" w:hAnsi="Arial"/>
+                <w:rFonts w:ascii="Century" w:hAnsi="Century" w:eastAsia="Century" w:cs="Century"/>
                 <w:b/>
                 <w:color w:val="C65911"/>
-                <w:sz w:val="18"/>
+                <w:sz w:val="21"/>
+                <w:szCs w:val="21"/>
               </w:rPr>
               <w:t>High</w:t>
             </w:r>
@@ -2304,11 +2896,17 @@
             <w:pPr>
               <w:pStyle w:val="Compact"/>
               <w:spacing w:before="0" w:after="0" w:line="252" w:lineRule="auto"/>
+              <w:rPr>
+                <w:rFonts w:ascii="Century" w:hAnsi="Century" w:eastAsia="Century" w:cs="Century"/>
+                <w:sz w:val="21"/>
+                <w:szCs w:val="21"/>
+              </w:rPr>
             </w:pPr>
             <w:r>
               <w:rPr>
-                <w:rFonts w:ascii="Arial" w:hAnsi="Arial"/>
-                <w:sz w:val="18"/>
+                <w:rFonts w:ascii="Century" w:hAnsi="Century" w:eastAsia="Century" w:cs="Century"/>
+                <w:sz w:val="21"/>
+                <w:szCs w:val="21"/>
               </w:rPr>
               <w:t>Significant security weakness</w:t>
             </w:r>
@@ -2331,13 +2929,19 @@
             <w:pPr>
               <w:pStyle w:val="Compact"/>
               <w:spacing w:before="0" w:after="0" w:line="252" w:lineRule="auto"/>
+              <w:rPr>
+                <w:rFonts w:ascii="Century" w:hAnsi="Century" w:eastAsia="Century" w:cs="Century"/>
+                <w:sz w:val="21"/>
+                <w:szCs w:val="21"/>
+              </w:rPr>
             </w:pPr>
             <w:r>
               <w:rPr>
-                <w:rFonts w:ascii="Arial" w:hAnsi="Arial"/>
+                <w:rFonts w:ascii="Century" w:hAnsi="Century" w:eastAsia="Century" w:cs="Century"/>
                 <w:b/>
                 <w:color w:val="9C6500"/>
-                <w:sz w:val="18"/>
+                <w:sz w:val="21"/>
+                <w:szCs w:val="21"/>
               </w:rPr>
               <w:t>Medium</w:t>
             </w:r>
@@ -2358,11 +2962,17 @@
             <w:pPr>
               <w:pStyle w:val="Compact"/>
               <w:spacing w:before="0" w:after="0" w:line="252" w:lineRule="auto"/>
+              <w:rPr>
+                <w:rFonts w:ascii="Century" w:hAnsi="Century" w:eastAsia="Century" w:cs="Century"/>
+                <w:sz w:val="21"/>
+                <w:szCs w:val="21"/>
+              </w:rPr>
             </w:pPr>
             <w:r>
               <w:rPr>
-                <w:rFonts w:ascii="Arial" w:hAnsi="Arial"/>
-                <w:sz w:val="18"/>
+                <w:rFonts w:ascii="Century" w:hAnsi="Century" w:eastAsia="Century" w:cs="Century"/>
+                <w:sz w:val="21"/>
+                <w:szCs w:val="21"/>
               </w:rPr>
               <w:t>Moderate security weakness</w:t>
             </w:r>
@@ -2385,13 +2995,19 @@
             <w:pPr>
               <w:pStyle w:val="Compact"/>
               <w:spacing w:before="0" w:after="0" w:line="252" w:lineRule="auto"/>
+              <w:rPr>
+                <w:rFonts w:ascii="Century" w:hAnsi="Century" w:eastAsia="Century" w:cs="Century"/>
+                <w:sz w:val="21"/>
+                <w:szCs w:val="21"/>
+              </w:rPr>
             </w:pPr>
             <w:r>
               <w:rPr>
-                <w:rFonts w:ascii="Arial" w:hAnsi="Arial"/>
+                <w:rFonts w:ascii="Century" w:hAnsi="Century" w:eastAsia="Century" w:cs="Century"/>
                 <w:b/>
                 <w:color w:val="375E1D"/>
-                <w:sz w:val="18"/>
+                <w:sz w:val="21"/>
+                <w:szCs w:val="21"/>
               </w:rPr>
               <w:t>Low</w:t>
             </w:r>
@@ -2412,11 +3028,17 @@
             <w:pPr>
               <w:pStyle w:val="Compact"/>
               <w:spacing w:before="0" w:after="0" w:line="252" w:lineRule="auto"/>
+              <w:rPr>
+                <w:rFonts w:ascii="Century" w:hAnsi="Century" w:eastAsia="Century" w:cs="Century"/>
+                <w:sz w:val="21"/>
+                <w:szCs w:val="21"/>
+              </w:rPr>
             </w:pPr>
             <w:r>
               <w:rPr>
-                <w:rFonts w:ascii="Arial" w:hAnsi="Arial"/>
-                <w:sz w:val="18"/>
+                <w:rFonts w:ascii="Century" w:hAnsi="Century" w:eastAsia="Century" w:cs="Century"/>
+                <w:sz w:val="21"/>
+                <w:szCs w:val="21"/>
               </w:rPr>
               <w:t>Minor security issue</w:t>
             </w:r>
@@ -2439,13 +3061,19 @@
             <w:pPr>
               <w:pStyle w:val="Compact"/>
               <w:spacing w:before="0" w:after="0" w:line="252" w:lineRule="auto"/>
+              <w:rPr>
+                <w:rFonts w:ascii="Century" w:hAnsi="Century" w:eastAsia="Century" w:cs="Century"/>
+                <w:sz w:val="21"/>
+                <w:szCs w:val="21"/>
+              </w:rPr>
             </w:pPr>
             <w:r>
               <w:rPr>
-                <w:rFonts w:ascii="Arial" w:hAnsi="Arial"/>
+                <w:rFonts w:ascii="Century" w:hAnsi="Century" w:eastAsia="Century" w:cs="Century"/>
                 <w:b/>
                 <w:color w:val="1F4E79"/>
-                <w:sz w:val="18"/>
+                <w:sz w:val="21"/>
+                <w:szCs w:val="21"/>
               </w:rPr>
               <w:t>Informational</w:t>
             </w:r>
@@ -2466,11 +3094,17 @@
             <w:pPr>
               <w:pStyle w:val="Compact"/>
               <w:spacing w:before="0" w:after="0" w:line="252" w:lineRule="auto"/>
+              <w:rPr>
+                <w:rFonts w:ascii="Century" w:hAnsi="Century" w:eastAsia="Century" w:cs="Century"/>
+                <w:sz w:val="21"/>
+                <w:szCs w:val="21"/>
+              </w:rPr>
             </w:pPr>
             <w:r>
               <w:rPr>
-                <w:rFonts w:ascii="Arial" w:hAnsi="Arial"/>
-                <w:sz w:val="18"/>
+                <w:rFonts w:ascii="Century" w:hAnsi="Century" w:eastAsia="Century" w:cs="Century"/>
+                <w:sz w:val="21"/>
+                <w:szCs w:val="21"/>
               </w:rPr>
               <w:t>Best practice recommendation</w:t>
             </w:r>
@@ -2478,7 +3112,18 @@
         </w:tc>
       </w:tr>
     </w:tbl>
-    <w:p/>
+    <w:p>
+      <w:pPr>
+        <w:rPr>
+          <w:rFonts w:ascii="Century" w:hAnsi="Century" w:eastAsia="Century" w:cs="Century"/>
+          <w:sz w:val="21"/>
+          <w:szCs w:val="21"/>
+        </w:rPr>
+      </w:pPr>
+    </w:p>
+    <w:sectPr>
+      <w:footerReference w:type="default" r:id="rId9"/>
+    </w:sectPr>
   </w:body>
 </w:document>
 </file>
@@ -3314,9 +3959,9 @@
   <w:docDefaults>
     <w:rPrDefault>
       <w:rPr>
-        <w:rFonts w:asciiTheme="minorHAnsi" w:eastAsiaTheme="minorEastAsia" w:hAnsiTheme="minorHAnsi" w:cstheme="minorBidi"/>
-        <w:sz w:val="24"/>
-        <w:szCs w:val="24"/>
+        <w:rFonts w:ascii="Century" w:hAnsi="Century" w:eastAsia="Century" w:cs="Century"/>
+        <w:sz w:val="21"/>
+        <w:szCs w:val="21"/>
         <w:lang w:val="en-US" w:eastAsia="en-US" w:bidi="ar-SA"/>
       </w:rPr>
     </w:rPrDefault>
@@ -3583,8 +4228,9 @@
       <w:spacing w:after="80"/>
     </w:pPr>
     <w:rPr>
-      <w:rFonts w:ascii="Arial" w:hAnsi="Arial" w:eastAsia="PingFang SC"/>
+      <w:rFonts w:ascii="Century" w:hAnsi="Century" w:eastAsia="Century" w:cs="Century"/>
       <w:sz w:val="21"/>
+      <w:szCs w:val="21"/>
     </w:rPr>
   </w:style>
   <w:style w:type="paragraph" w:styleId="1">
@@ -3602,11 +4248,11 @@
       <w:outlineLvl w:val="0"/>
     </w:pPr>
     <w:rPr>
-      <w:rFonts w:asciiTheme="majorHAnsi" w:eastAsiaTheme="majorEastAsia" w:hAnsiTheme="majorHAnsi" w:cstheme="majorBidi" w:ascii="Arial" w:hAnsi="Arial" w:eastAsia="PingFang SC"/>
+      <w:rFonts w:ascii="Century" w:hAnsi="Century" w:eastAsia="Century" w:cs="Century"/>
       <w:b/>
       <w:color w:val="0F4C5C"/>
-      <w:sz w:val="40"/>
-      <w:szCs w:val="40"/>
+      <w:sz w:val="21"/>
+      <w:szCs w:val="21"/>
     </w:rPr>
   </w:style>
   <w:style w:type="paragraph" w:styleId="2">
@@ -3626,11 +4272,11 @@
       <w:outlineLvl w:val="1"/>
     </w:pPr>
     <w:rPr>
-      <w:rFonts w:asciiTheme="majorHAnsi" w:eastAsiaTheme="majorEastAsia" w:hAnsiTheme="majorHAnsi" w:cstheme="majorBidi" w:ascii="Arial" w:hAnsi="Arial" w:eastAsia="PingFang SC"/>
+      <w:rFonts w:ascii="Century" w:hAnsi="Century" w:eastAsia="Century" w:cs="Century"/>
       <w:b/>
       <w:color w:val="0F4C5C"/>
-      <w:sz w:val="30"/>
-      <w:szCs w:val="32"/>
+      <w:sz w:val="21"/>
+      <w:szCs w:val="21"/>
     </w:rPr>
   </w:style>
   <w:style w:type="paragraph" w:styleId="3">
@@ -3650,11 +4296,11 @@
       <w:outlineLvl w:val="2"/>
     </w:pPr>
     <w:rPr>
-      <w:rFonts w:eastAsiaTheme="majorEastAsia" w:cstheme="majorBidi" w:ascii="Arial" w:hAnsi="Arial" w:eastAsia="PingFang SC"/>
+      <w:rFonts w:ascii="Century" w:hAnsi="Century" w:eastAsia="Century" w:cs="Century"/>
       <w:b/>
       <w:color w:val="0F4C5C"/>
-      <w:sz w:val="24"/>
-      <w:szCs w:val="28"/>
+      <w:sz w:val="21"/>
+      <w:szCs w:val="21"/>
     </w:rPr>
   </w:style>
   <w:style w:type="paragraph" w:styleId="4">
@@ -3674,10 +4320,12 @@
       <w:outlineLvl w:val="3"/>
     </w:pPr>
     <w:rPr>
-      <w:rFonts w:eastAsiaTheme="majorEastAsia" w:cstheme="majorBidi"/>
+      <w:rFonts w:ascii="Century" w:hAnsi="Century" w:eastAsia="Century" w:cs="Century"/>
       <w:i/>
       <w:iCs/>
       <w:color w:val="0F4761" w:themeColor="accent1" w:themeShade="BF"/>
+      <w:sz w:val="21"/>
+      <w:szCs w:val="21"/>
     </w:rPr>
   </w:style>
   <w:style w:type="paragraph" w:styleId="5">
@@ -3697,8 +4345,10 @@
       <w:outlineLvl w:val="4"/>
     </w:pPr>
     <w:rPr>
-      <w:rFonts w:eastAsiaTheme="majorEastAsia" w:cstheme="majorBidi"/>
+      <w:rFonts w:ascii="Century" w:hAnsi="Century" w:eastAsia="Century" w:cs="Century"/>
       <w:color w:val="0F4761" w:themeColor="accent1" w:themeShade="BF"/>
+      <w:sz w:val="21"/>
+      <w:szCs w:val="21"/>
     </w:rPr>
   </w:style>
   <w:style w:type="paragraph" w:styleId="6">
@@ -3718,10 +4368,12 @@
       <w:outlineLvl w:val="5"/>
     </w:pPr>
     <w:rPr>
-      <w:rFonts w:eastAsiaTheme="majorEastAsia" w:cstheme="majorBidi"/>
+      <w:rFonts w:ascii="Century" w:hAnsi="Century" w:eastAsia="Century" w:cs="Century"/>
       <w:i/>
       <w:iCs/>
       <w:color w:val="595959" w:themeColor="text1" w:themeTint="A6"/>
+      <w:sz w:val="21"/>
+      <w:szCs w:val="21"/>
     </w:rPr>
   </w:style>
   <w:style w:type="paragraph" w:styleId="7">
@@ -3741,8 +4393,10 @@
       <w:outlineLvl w:val="6"/>
     </w:pPr>
     <w:rPr>
-      <w:rFonts w:eastAsiaTheme="majorEastAsia" w:cstheme="majorBidi"/>
+      <w:rFonts w:ascii="Century" w:hAnsi="Century" w:eastAsia="Century" w:cs="Century"/>
       <w:color w:val="595959" w:themeColor="text1" w:themeTint="A6"/>
+      <w:sz w:val="21"/>
+      <w:szCs w:val="21"/>
     </w:rPr>
   </w:style>
   <w:style w:type="paragraph" w:styleId="8">
@@ -3762,10 +4416,12 @@
       <w:outlineLvl w:val="7"/>
     </w:pPr>
     <w:rPr>
-      <w:rFonts w:eastAsiaTheme="majorEastAsia" w:cstheme="majorBidi"/>
+      <w:rFonts w:ascii="Century" w:hAnsi="Century" w:eastAsia="Century" w:cs="Century"/>
       <w:i/>
       <w:iCs/>
       <w:color w:val="272727" w:themeColor="text1" w:themeTint="D8"/>
+      <w:sz w:val="21"/>
+      <w:szCs w:val="21"/>
     </w:rPr>
   </w:style>
   <w:style w:type="paragraph" w:styleId="9">
@@ -3785,8 +4441,10 @@
       <w:outlineLvl w:val="8"/>
     </w:pPr>
     <w:rPr>
-      <w:rFonts w:eastAsiaTheme="majorEastAsia" w:cstheme="majorBidi"/>
+      <w:rFonts w:ascii="Century" w:hAnsi="Century" w:eastAsia="Century" w:cs="Century"/>
       <w:color w:val="272727" w:themeColor="text1" w:themeTint="D8"/>
+      <w:sz w:val="21"/>
+      <w:szCs w:val="21"/>
     </w:rPr>
   </w:style>
   <w:style w:type="character" w:default="1" w:styleId="a1">
@@ -3852,11 +4510,11 @@
       <w:jc w:val="center"/>
     </w:pPr>
     <w:rPr>
-      <w:rFonts w:asciiTheme="majorHAnsi" w:eastAsiaTheme="majorEastAsia" w:hAnsiTheme="majorHAnsi" w:cstheme="majorBidi"/>
+      <w:rFonts w:ascii="Century" w:hAnsi="Century" w:eastAsia="Century" w:cs="Century"/>
       <w:spacing w:val="-10"/>
       <w:kern w:val="28"/>
-      <w:sz w:val="56"/>
-      <w:szCs w:val="56"/>
+      <w:sz w:val="21"/>
+      <w:szCs w:val="21"/>
     </w:rPr>
   </w:style>
   <w:style w:type="character" w:customStyle="1" w:styleId="a6">
@@ -3866,11 +4524,11 @@
     <w:uiPriority w:val="10"/>
     <w:rsid w:val="00A10FD9"/>
     <w:rPr>
-      <w:rFonts w:asciiTheme="majorHAnsi" w:eastAsiaTheme="majorEastAsia" w:hAnsiTheme="majorHAnsi" w:cstheme="majorBidi"/>
+      <w:rFonts w:ascii="Century" w:hAnsi="Century" w:eastAsia="Century" w:cs="Century"/>
       <w:spacing w:val="-10"/>
       <w:kern w:val="28"/>
-      <w:sz w:val="56"/>
-      <w:szCs w:val="56"/>
+      <w:sz w:val="21"/>
+      <w:szCs w:val="21"/>
     </w:rPr>
   </w:style>
   <w:style w:type="paragraph" w:styleId="a7">
@@ -3887,9 +4545,10 @@
       </w:numPr>
     </w:pPr>
     <w:rPr>
+      <w:rFonts w:ascii="Century" w:hAnsi="Century" w:eastAsia="Century" w:cs="Century"/>
       <w:spacing w:val="15"/>
-      <w:sz w:val="28"/>
-      <w:szCs w:val="28"/>
+      <w:sz w:val="21"/>
+      <w:szCs w:val="21"/>
     </w:rPr>
   </w:style>
   <w:style w:type="character" w:customStyle="1" w:styleId="a8">
@@ -3899,11 +4558,11 @@
     <w:uiPriority w:val="11"/>
     <w:rsid w:val="00A10FD9"/>
     <w:rPr>
-      <w:rFonts w:eastAsiaTheme="majorEastAsia" w:cstheme="majorBidi"/>
+      <w:rFonts w:ascii="Century" w:hAnsi="Century" w:eastAsia="Century" w:cs="Century"/>
       <w:color w:val="595959" w:themeColor="text1" w:themeTint="A6"/>
       <w:spacing w:val="15"/>
-      <w:sz w:val="28"/>
-      <w:szCs w:val="28"/>
+      <w:sz w:val="21"/>
+      <w:szCs w:val="21"/>
     </w:rPr>
   </w:style>
   <w:style w:type="paragraph" w:customStyle="1" w:styleId="Author">
@@ -3938,9 +4597,10 @@
       <w:jc w:val="center"/>
     </w:pPr>
     <w:rPr>
+      <w:rFonts w:ascii="Century" w:hAnsi="Century" w:eastAsia="Century" w:cs="Century"/>
       <w:b/>
-      <w:sz w:val="20"/>
-      <w:szCs w:val="20"/>
+      <w:sz w:val="21"/>
+      <w:szCs w:val="21"/>
     </w:rPr>
   </w:style>
   <w:style w:type="paragraph" w:customStyle="1" w:styleId="Abstract">
@@ -3954,8 +4614,9 @@
       <w:spacing w:before="100" w:after="300"/>
     </w:pPr>
     <w:rPr>
-      <w:sz w:val="20"/>
-      <w:szCs w:val="20"/>
+      <w:rFonts w:ascii="Century" w:hAnsi="Century" w:eastAsia="Century" w:cs="Century"/>
+      <w:sz w:val="21"/>
+      <w:szCs w:val="21"/>
     </w:rPr>
   </w:style>
   <w:style w:type="paragraph" w:styleId="aa">
@@ -3970,10 +4631,10 @@
     <w:uiPriority w:val="9"/>
     <w:rsid w:val="00A10FD9"/>
     <w:rPr>
-      <w:rFonts w:asciiTheme="majorHAnsi" w:eastAsiaTheme="majorEastAsia" w:hAnsiTheme="majorHAnsi" w:cstheme="majorBidi"/>
+      <w:rFonts w:ascii="Century" w:hAnsi="Century" w:eastAsia="Century" w:cs="Century"/>
       <w:color w:val="0F4761" w:themeColor="accent1" w:themeShade="BF"/>
-      <w:sz w:val="40"/>
-      <w:szCs w:val="40"/>
+      <w:sz w:val="21"/>
+      <w:szCs w:val="21"/>
     </w:rPr>
   </w:style>
   <w:style w:type="character" w:customStyle="1" w:styleId="20">
@@ -3984,10 +4645,10 @@
     <w:semiHidden/>
     <w:rsid w:val="00A10FD9"/>
     <w:rPr>
-      <w:rFonts w:asciiTheme="majorHAnsi" w:eastAsiaTheme="majorEastAsia" w:hAnsiTheme="majorHAnsi" w:cstheme="majorBidi"/>
+      <w:rFonts w:ascii="Century" w:hAnsi="Century" w:eastAsia="Century" w:cs="Century"/>
       <w:color w:val="0F4761" w:themeColor="accent1" w:themeShade="BF"/>
-      <w:sz w:val="32"/>
-      <w:szCs w:val="32"/>
+      <w:sz w:val="21"/>
+      <w:szCs w:val="21"/>
     </w:rPr>
   </w:style>
   <w:style w:type="character" w:customStyle="1" w:styleId="30">
@@ -3998,10 +4659,10 @@
     <w:semiHidden/>
     <w:rsid w:val="00A10FD9"/>
     <w:rPr>
-      <w:rFonts w:eastAsiaTheme="majorEastAsia" w:cstheme="majorBidi"/>
+      <w:rFonts w:ascii="Century" w:hAnsi="Century" w:eastAsia="Century" w:cs="Century"/>
       <w:color w:val="0F4761" w:themeColor="accent1" w:themeShade="BF"/>
-      <w:sz w:val="28"/>
-      <w:szCs w:val="28"/>
+      <w:sz w:val="21"/>
+      <w:szCs w:val="21"/>
     </w:rPr>
   </w:style>
   <w:style w:type="character" w:customStyle="1" w:styleId="40">
@@ -4012,10 +4673,12 @@
     <w:semiHidden/>
     <w:rsid w:val="00A10FD9"/>
     <w:rPr>
-      <w:rFonts w:eastAsiaTheme="majorEastAsia" w:cstheme="majorBidi"/>
+      <w:rFonts w:ascii="Century" w:hAnsi="Century" w:eastAsia="Century" w:cs="Century"/>
       <w:i/>
       <w:iCs/>
       <w:color w:val="0F4761" w:themeColor="accent1" w:themeShade="BF"/>
+      <w:sz w:val="21"/>
+      <w:szCs w:val="21"/>
     </w:rPr>
   </w:style>
   <w:style w:type="character" w:customStyle="1" w:styleId="50">
@@ -4026,8 +4689,10 @@
     <w:semiHidden/>
     <w:rsid w:val="00A10FD9"/>
     <w:rPr>
-      <w:rFonts w:eastAsiaTheme="majorEastAsia" w:cstheme="majorBidi"/>
+      <w:rFonts w:ascii="Century" w:hAnsi="Century" w:eastAsia="Century" w:cs="Century"/>
       <w:color w:val="0F4761" w:themeColor="accent1" w:themeShade="BF"/>
+      <w:sz w:val="21"/>
+      <w:szCs w:val="21"/>
     </w:rPr>
   </w:style>
   <w:style w:type="character" w:customStyle="1" w:styleId="60">
@@ -4038,10 +4703,12 @@
     <w:semiHidden/>
     <w:rsid w:val="00A10FD9"/>
     <w:rPr>
-      <w:rFonts w:eastAsiaTheme="majorEastAsia" w:cstheme="majorBidi"/>
+      <w:rFonts w:ascii="Century" w:hAnsi="Century" w:eastAsia="Century" w:cs="Century"/>
       <w:i/>
       <w:iCs/>
       <w:color w:val="595959" w:themeColor="text1" w:themeTint="A6"/>
+      <w:sz w:val="21"/>
+      <w:szCs w:val="21"/>
     </w:rPr>
   </w:style>
   <w:style w:type="character" w:customStyle="1" w:styleId="70">
@@ -4052,8 +4719,10 @@
     <w:semiHidden/>
     <w:rsid w:val="00A10FD9"/>
     <w:rPr>
-      <w:rFonts w:eastAsiaTheme="majorEastAsia" w:cstheme="majorBidi"/>
+      <w:rFonts w:ascii="Century" w:hAnsi="Century" w:eastAsia="Century" w:cs="Century"/>
       <w:color w:val="595959" w:themeColor="text1" w:themeTint="A6"/>
+      <w:sz w:val="21"/>
+      <w:szCs w:val="21"/>
     </w:rPr>
   </w:style>
   <w:style w:type="character" w:customStyle="1" w:styleId="80">
@@ -4064,10 +4733,12 @@
     <w:semiHidden/>
     <w:rsid w:val="00A10FD9"/>
     <w:rPr>
-      <w:rFonts w:eastAsiaTheme="majorEastAsia" w:cstheme="majorBidi"/>
+      <w:rFonts w:ascii="Century" w:hAnsi="Century" w:eastAsia="Century" w:cs="Century"/>
       <w:i/>
       <w:iCs/>
       <w:color w:val="272727" w:themeColor="text1" w:themeTint="D8"/>
+      <w:sz w:val="21"/>
+      <w:szCs w:val="21"/>
     </w:rPr>
   </w:style>
   <w:style w:type="character" w:customStyle="1" w:styleId="90">
@@ -4078,8 +4749,10 @@
     <w:semiHidden/>
     <w:rsid w:val="00A10FD9"/>
     <w:rPr>
-      <w:rFonts w:eastAsiaTheme="majorEastAsia" w:cstheme="majorBidi"/>
+      <w:rFonts w:ascii="Century" w:hAnsi="Century" w:eastAsia="Century" w:cs="Century"/>
       <w:color w:val="272727" w:themeColor="text1" w:themeTint="D8"/>
+      <w:sz w:val="21"/>
+      <w:szCs w:val="21"/>
     </w:rPr>
   </w:style>
   <w:style w:type="paragraph" w:styleId="ab">
@@ -4152,7 +4825,10 @@
       <w:spacing w:after="0"/>
     </w:pPr>
     <w:rPr>
+      <w:rFonts w:ascii="Century" w:hAnsi="Century" w:eastAsia="Century" w:cs="Century"/>
       <w:b/>
+      <w:sz w:val="21"/>
+      <w:szCs w:val="21"/>
     </w:rPr>
   </w:style>
   <w:style w:type="paragraph" w:customStyle="1" w:styleId="Definition">
@@ -4167,7 +4843,10 @@
       <w:spacing w:after="120"/>
     </w:pPr>
     <w:rPr>
+      <w:rFonts w:ascii="Century" w:hAnsi="Century" w:eastAsia="Century" w:cs="Century"/>
       <w:i/>
+      <w:sz w:val="21"/>
+      <w:szCs w:val="21"/>
     </w:rPr>
   </w:style>
   <w:style w:type="paragraph" w:customStyle="1" w:styleId="TableCaption">
@@ -4202,8 +4881,9 @@
     <w:basedOn w:val="ae"/>
     <w:link w:val="SourceCode"/>
     <w:rPr>
-      <w:rFonts w:ascii="Consolas" w:hAnsi="Consolas"/>
-      <w:sz w:val="22"/>
+      <w:rFonts w:ascii="Century" w:hAnsi="Century" w:eastAsia="Century" w:cs="Century"/>
+      <w:sz w:val="21"/>
+      <w:szCs w:val="21"/>
     </w:rPr>
   </w:style>
   <w:style w:type="character" w:customStyle="1" w:styleId="SectionNumber">
@@ -4214,7 +4894,10 @@
     <w:name w:val="footnote reference"/>
     <w:basedOn w:val="ae"/>
     <w:rPr>
+      <w:rFonts w:ascii="Century" w:hAnsi="Century" w:eastAsia="Century" w:cs="Century"/>
       <w:vertAlign w:val="superscript"/>
+      <w:sz w:val="21"/>
+      <w:szCs w:val="21"/>
     </w:rPr>
   </w:style>
   <w:style w:type="character" w:styleId="af0">
@@ -4222,7 +4905,10 @@
     <w:basedOn w:val="ae"/>
     <w:uiPriority w:val="99"/>
     <w:rPr>
+      <w:rFonts w:ascii="Century" w:hAnsi="Century" w:eastAsia="Century" w:cs="Century"/>
       <w:color w:val="156082" w:themeColor="accent1"/>
+      <w:sz w:val="21"/>
+      <w:szCs w:val="21"/>
     </w:rPr>
   </w:style>
   <w:style w:type="paragraph" w:styleId="TOC">
@@ -4249,291 +4935,322 @@
     <w:name w:val="KeywordTok"/>
     <w:basedOn w:val="VerbatimChar"/>
     <w:rPr>
-      <w:rFonts w:ascii="Consolas" w:hAnsi="Consolas"/>
+      <w:rFonts w:ascii="Century" w:hAnsi="Century" w:eastAsia="Century" w:cs="Century"/>
       <w:b/>
       <w:color w:val="007020"/>
-      <w:sz w:val="22"/>
+      <w:sz w:val="21"/>
+      <w:szCs w:val="21"/>
     </w:rPr>
   </w:style>
   <w:style w:type="character" w:customStyle="1" w:styleId="DataTypeTok">
     <w:name w:val="DataTypeTok"/>
     <w:basedOn w:val="VerbatimChar"/>
     <w:rPr>
-      <w:rFonts w:ascii="Consolas" w:hAnsi="Consolas"/>
+      <w:rFonts w:ascii="Century" w:hAnsi="Century" w:eastAsia="Century" w:cs="Century"/>
       <w:color w:val="902000"/>
-      <w:sz w:val="22"/>
+      <w:sz w:val="21"/>
+      <w:szCs w:val="21"/>
     </w:rPr>
   </w:style>
   <w:style w:type="character" w:customStyle="1" w:styleId="DecValTok">
     <w:name w:val="DecValTok"/>
     <w:basedOn w:val="VerbatimChar"/>
     <w:rPr>
-      <w:rFonts w:ascii="Consolas" w:hAnsi="Consolas"/>
+      <w:rFonts w:ascii="Century" w:hAnsi="Century" w:eastAsia="Century" w:cs="Century"/>
       <w:color w:val="40A070"/>
-      <w:sz w:val="22"/>
+      <w:sz w:val="21"/>
+      <w:szCs w:val="21"/>
     </w:rPr>
   </w:style>
   <w:style w:type="character" w:customStyle="1" w:styleId="BaseNTok">
     <w:name w:val="BaseNTok"/>
     <w:basedOn w:val="VerbatimChar"/>
     <w:rPr>
-      <w:rFonts w:ascii="Consolas" w:hAnsi="Consolas"/>
+      <w:rFonts w:ascii="Century" w:hAnsi="Century" w:eastAsia="Century" w:cs="Century"/>
       <w:color w:val="40A070"/>
-      <w:sz w:val="22"/>
+      <w:sz w:val="21"/>
+      <w:szCs w:val="21"/>
     </w:rPr>
   </w:style>
   <w:style w:type="character" w:customStyle="1" w:styleId="FloatTok">
     <w:name w:val="FloatTok"/>
     <w:basedOn w:val="VerbatimChar"/>
     <w:rPr>
-      <w:rFonts w:ascii="Consolas" w:hAnsi="Consolas"/>
+      <w:rFonts w:ascii="Century" w:hAnsi="Century" w:eastAsia="Century" w:cs="Century"/>
       <w:color w:val="40A070"/>
-      <w:sz w:val="22"/>
+      <w:sz w:val="21"/>
+      <w:szCs w:val="21"/>
     </w:rPr>
   </w:style>
   <w:style w:type="character" w:customStyle="1" w:styleId="ConstantTok">
     <w:name w:val="ConstantTok"/>
     <w:basedOn w:val="VerbatimChar"/>
     <w:rPr>
-      <w:rFonts w:ascii="Consolas" w:hAnsi="Consolas"/>
+      <w:rFonts w:ascii="Century" w:hAnsi="Century" w:eastAsia="Century" w:cs="Century"/>
       <w:color w:val="880000"/>
-      <w:sz w:val="22"/>
+      <w:sz w:val="21"/>
+      <w:szCs w:val="21"/>
     </w:rPr>
   </w:style>
   <w:style w:type="character" w:customStyle="1" w:styleId="CharTok">
     <w:name w:val="CharTok"/>
     <w:basedOn w:val="VerbatimChar"/>
     <w:rPr>
-      <w:rFonts w:ascii="Consolas" w:hAnsi="Consolas"/>
+      <w:rFonts w:ascii="Century" w:hAnsi="Century" w:eastAsia="Century" w:cs="Century"/>
       <w:color w:val="4070A0"/>
-      <w:sz w:val="22"/>
+      <w:sz w:val="21"/>
+      <w:szCs w:val="21"/>
     </w:rPr>
   </w:style>
   <w:style w:type="character" w:customStyle="1" w:styleId="SpecialCharTok">
     <w:name w:val="SpecialCharTok"/>
     <w:basedOn w:val="VerbatimChar"/>
     <w:rPr>
-      <w:rFonts w:ascii="Consolas" w:hAnsi="Consolas"/>
+      <w:rFonts w:ascii="Century" w:hAnsi="Century" w:eastAsia="Century" w:cs="Century"/>
       <w:color w:val="4070A0"/>
-      <w:sz w:val="22"/>
+      <w:sz w:val="21"/>
+      <w:szCs w:val="21"/>
     </w:rPr>
   </w:style>
   <w:style w:type="character" w:customStyle="1" w:styleId="StringTok">
     <w:name w:val="StringTok"/>
     <w:basedOn w:val="VerbatimChar"/>
     <w:rPr>
-      <w:rFonts w:ascii="Consolas" w:hAnsi="Consolas"/>
+      <w:rFonts w:ascii="Century" w:hAnsi="Century" w:eastAsia="Century" w:cs="Century"/>
       <w:color w:val="4070A0"/>
-      <w:sz w:val="22"/>
+      <w:sz w:val="21"/>
+      <w:szCs w:val="21"/>
     </w:rPr>
   </w:style>
   <w:style w:type="character" w:customStyle="1" w:styleId="VerbatimStringTok">
     <w:name w:val="VerbatimStringTok"/>
     <w:basedOn w:val="VerbatimChar"/>
     <w:rPr>
-      <w:rFonts w:ascii="Consolas" w:hAnsi="Consolas"/>
+      <w:rFonts w:ascii="Century" w:hAnsi="Century" w:eastAsia="Century" w:cs="Century"/>
       <w:color w:val="4070A0"/>
-      <w:sz w:val="22"/>
+      <w:sz w:val="21"/>
+      <w:szCs w:val="21"/>
     </w:rPr>
   </w:style>
   <w:style w:type="character" w:customStyle="1" w:styleId="SpecialStringTok">
     <w:name w:val="SpecialStringTok"/>
     <w:basedOn w:val="VerbatimChar"/>
     <w:rPr>
-      <w:rFonts w:ascii="Consolas" w:hAnsi="Consolas"/>
+      <w:rFonts w:ascii="Century" w:hAnsi="Century" w:eastAsia="Century" w:cs="Century"/>
       <w:color w:val="BB6688"/>
-      <w:sz w:val="22"/>
+      <w:sz w:val="21"/>
+      <w:szCs w:val="21"/>
     </w:rPr>
   </w:style>
   <w:style w:type="character" w:customStyle="1" w:styleId="ImportTok">
     <w:name w:val="ImportTok"/>
     <w:basedOn w:val="VerbatimChar"/>
     <w:rPr>
-      <w:rFonts w:ascii="Consolas" w:hAnsi="Consolas"/>
+      <w:rFonts w:ascii="Century" w:hAnsi="Century" w:eastAsia="Century" w:cs="Century"/>
       <w:b/>
       <w:color w:val="008000"/>
-      <w:sz w:val="22"/>
+      <w:sz w:val="21"/>
+      <w:szCs w:val="21"/>
     </w:rPr>
   </w:style>
   <w:style w:type="character" w:customStyle="1" w:styleId="CommentTok">
     <w:name w:val="CommentTok"/>
     <w:basedOn w:val="VerbatimChar"/>
     <w:rPr>
-      <w:rFonts w:ascii="Consolas" w:hAnsi="Consolas"/>
+      <w:rFonts w:ascii="Century" w:hAnsi="Century" w:eastAsia="Century" w:cs="Century"/>
       <w:i/>
       <w:color w:val="60A0B0"/>
-      <w:sz w:val="22"/>
+      <w:sz w:val="21"/>
+      <w:szCs w:val="21"/>
     </w:rPr>
   </w:style>
   <w:style w:type="character" w:customStyle="1" w:styleId="DocumentationTok">
     <w:name w:val="DocumentationTok"/>
     <w:basedOn w:val="VerbatimChar"/>
     <w:rPr>
-      <w:rFonts w:ascii="Consolas" w:hAnsi="Consolas"/>
+      <w:rFonts w:ascii="Century" w:hAnsi="Century" w:eastAsia="Century" w:cs="Century"/>
       <w:i/>
       <w:color w:val="BA2121"/>
-      <w:sz w:val="22"/>
+      <w:sz w:val="21"/>
+      <w:szCs w:val="21"/>
     </w:rPr>
   </w:style>
   <w:style w:type="character" w:customStyle="1" w:styleId="AnnotationTok">
     <w:name w:val="AnnotationTok"/>
     <w:basedOn w:val="VerbatimChar"/>
     <w:rPr>
-      <w:rFonts w:ascii="Consolas" w:hAnsi="Consolas"/>
+      <w:rFonts w:ascii="Century" w:hAnsi="Century" w:eastAsia="Century" w:cs="Century"/>
       <w:b/>
       <w:i/>
       <w:color w:val="60A0B0"/>
-      <w:sz w:val="22"/>
+      <w:sz w:val="21"/>
+      <w:szCs w:val="21"/>
     </w:rPr>
   </w:style>
   <w:style w:type="character" w:customStyle="1" w:styleId="CommentVarTok">
     <w:name w:val="CommentVarTok"/>
     <w:basedOn w:val="VerbatimChar"/>
     <w:rPr>
-      <w:rFonts w:ascii="Consolas" w:hAnsi="Consolas"/>
+      <w:rFonts w:ascii="Century" w:hAnsi="Century" w:eastAsia="Century" w:cs="Century"/>
       <w:b/>
       <w:i/>
       <w:color w:val="60A0B0"/>
-      <w:sz w:val="22"/>
+      <w:sz w:val="21"/>
+      <w:szCs w:val="21"/>
     </w:rPr>
   </w:style>
   <w:style w:type="character" w:customStyle="1" w:styleId="OtherTok">
     <w:name w:val="OtherTok"/>
     <w:basedOn w:val="VerbatimChar"/>
     <w:rPr>
-      <w:rFonts w:ascii="Consolas" w:hAnsi="Consolas"/>
+      <w:rFonts w:ascii="Century" w:hAnsi="Century" w:eastAsia="Century" w:cs="Century"/>
       <w:color w:val="007020"/>
-      <w:sz w:val="22"/>
+      <w:sz w:val="21"/>
+      <w:szCs w:val="21"/>
     </w:rPr>
   </w:style>
   <w:style w:type="character" w:customStyle="1" w:styleId="FunctionTok">
     <w:name w:val="FunctionTok"/>
     <w:basedOn w:val="VerbatimChar"/>
     <w:rPr>
-      <w:rFonts w:ascii="Consolas" w:hAnsi="Consolas"/>
+      <w:rFonts w:ascii="Century" w:hAnsi="Century" w:eastAsia="Century" w:cs="Century"/>
       <w:color w:val="06287E"/>
-      <w:sz w:val="22"/>
+      <w:sz w:val="21"/>
+      <w:szCs w:val="21"/>
     </w:rPr>
   </w:style>
   <w:style w:type="character" w:customStyle="1" w:styleId="VariableTok">
     <w:name w:val="VariableTok"/>
     <w:basedOn w:val="VerbatimChar"/>
     <w:rPr>
-      <w:rFonts w:ascii="Consolas" w:hAnsi="Consolas"/>
+      <w:rFonts w:ascii="Century" w:hAnsi="Century" w:eastAsia="Century" w:cs="Century"/>
       <w:color w:val="19177C"/>
-      <w:sz w:val="22"/>
+      <w:sz w:val="21"/>
+      <w:szCs w:val="21"/>
     </w:rPr>
   </w:style>
   <w:style w:type="character" w:customStyle="1" w:styleId="ControlFlowTok">
     <w:name w:val="ControlFlowTok"/>
     <w:basedOn w:val="VerbatimChar"/>
     <w:rPr>
-      <w:rFonts w:ascii="Consolas" w:hAnsi="Consolas"/>
+      <w:rFonts w:ascii="Century" w:hAnsi="Century" w:eastAsia="Century" w:cs="Century"/>
       <w:b/>
       <w:color w:val="007020"/>
-      <w:sz w:val="22"/>
+      <w:sz w:val="21"/>
+      <w:szCs w:val="21"/>
     </w:rPr>
   </w:style>
   <w:style w:type="character" w:customStyle="1" w:styleId="OperatorTok">
     <w:name w:val="OperatorTok"/>
     <w:basedOn w:val="VerbatimChar"/>
     <w:rPr>
-      <w:rFonts w:ascii="Consolas" w:hAnsi="Consolas"/>
+      <w:rFonts w:ascii="Century" w:hAnsi="Century" w:eastAsia="Century" w:cs="Century"/>
       <w:color w:val="666666"/>
-      <w:sz w:val="22"/>
+      <w:sz w:val="21"/>
+      <w:szCs w:val="21"/>
     </w:rPr>
   </w:style>
   <w:style w:type="character" w:customStyle="1" w:styleId="BuiltInTok">
     <w:name w:val="BuiltInTok"/>
     <w:basedOn w:val="VerbatimChar"/>
     <w:rPr>
-      <w:rFonts w:ascii="Consolas" w:hAnsi="Consolas"/>
+      <w:rFonts w:ascii="Century" w:hAnsi="Century" w:eastAsia="Century" w:cs="Century"/>
       <w:color w:val="008000"/>
-      <w:sz w:val="22"/>
+      <w:sz w:val="21"/>
+      <w:szCs w:val="21"/>
     </w:rPr>
   </w:style>
   <w:style w:type="character" w:customStyle="1" w:styleId="ExtensionTok">
     <w:name w:val="ExtensionTok"/>
     <w:basedOn w:val="VerbatimChar"/>
     <w:rPr>
-      <w:rFonts w:ascii="Consolas" w:hAnsi="Consolas"/>
-      <w:sz w:val="22"/>
+      <w:rFonts w:ascii="Century" w:hAnsi="Century" w:eastAsia="Century" w:cs="Century"/>
+      <w:sz w:val="21"/>
+      <w:szCs w:val="21"/>
     </w:rPr>
   </w:style>
   <w:style w:type="character" w:customStyle="1" w:styleId="PreprocessorTok">
     <w:name w:val="PreprocessorTok"/>
     <w:basedOn w:val="VerbatimChar"/>
     <w:rPr>
-      <w:rFonts w:ascii="Consolas" w:hAnsi="Consolas"/>
+      <w:rFonts w:ascii="Century" w:hAnsi="Century" w:eastAsia="Century" w:cs="Century"/>
       <w:color w:val="BC7A00"/>
-      <w:sz w:val="22"/>
+      <w:sz w:val="21"/>
+      <w:szCs w:val="21"/>
     </w:rPr>
   </w:style>
   <w:style w:type="character" w:customStyle="1" w:styleId="AttributeTok">
     <w:name w:val="AttributeTok"/>
     <w:basedOn w:val="VerbatimChar"/>
     <w:rPr>
-      <w:rFonts w:ascii="Consolas" w:hAnsi="Consolas"/>
+      <w:rFonts w:ascii="Century" w:hAnsi="Century" w:eastAsia="Century" w:cs="Century"/>
       <w:color w:val="7D9029"/>
-      <w:sz w:val="22"/>
+      <w:sz w:val="21"/>
+      <w:szCs w:val="21"/>
     </w:rPr>
   </w:style>
   <w:style w:type="character" w:customStyle="1" w:styleId="RegionMarkerTok">
     <w:name w:val="RegionMarkerTok"/>
     <w:basedOn w:val="VerbatimChar"/>
     <w:rPr>
-      <w:rFonts w:ascii="Consolas" w:hAnsi="Consolas"/>
-      <w:sz w:val="22"/>
+      <w:rFonts w:ascii="Century" w:hAnsi="Century" w:eastAsia="Century" w:cs="Century"/>
+      <w:sz w:val="21"/>
+      <w:szCs w:val="21"/>
     </w:rPr>
   </w:style>
   <w:style w:type="character" w:customStyle="1" w:styleId="InformationTok">
     <w:name w:val="InformationTok"/>
     <w:basedOn w:val="VerbatimChar"/>
     <w:rPr>
-      <w:rFonts w:ascii="Consolas" w:hAnsi="Consolas"/>
+      <w:rFonts w:ascii="Century" w:hAnsi="Century" w:eastAsia="Century" w:cs="Century"/>
       <w:b/>
       <w:i/>
       <w:color w:val="60A0B0"/>
-      <w:sz w:val="22"/>
+      <w:sz w:val="21"/>
+      <w:szCs w:val="21"/>
     </w:rPr>
   </w:style>
   <w:style w:type="character" w:customStyle="1" w:styleId="WarningTok">
     <w:name w:val="WarningTok"/>
     <w:basedOn w:val="VerbatimChar"/>
     <w:rPr>
-      <w:rFonts w:ascii="Consolas" w:hAnsi="Consolas"/>
+      <w:rFonts w:ascii="Century" w:hAnsi="Century" w:eastAsia="Century" w:cs="Century"/>
       <w:b/>
       <w:i/>
       <w:color w:val="60A0B0"/>
-      <w:sz w:val="22"/>
+      <w:sz w:val="21"/>
+      <w:szCs w:val="21"/>
     </w:rPr>
   </w:style>
   <w:style w:type="character" w:customStyle="1" w:styleId="AlertTok">
     <w:name w:val="AlertTok"/>
     <w:basedOn w:val="VerbatimChar"/>
     <w:rPr>
-      <w:rFonts w:ascii="Consolas" w:hAnsi="Consolas"/>
+      <w:rFonts w:ascii="Century" w:hAnsi="Century" w:eastAsia="Century" w:cs="Century"/>
       <w:b/>
       <w:color w:val="FF0000"/>
-      <w:sz w:val="22"/>
+      <w:sz w:val="21"/>
+      <w:szCs w:val="21"/>
     </w:rPr>
   </w:style>
   <w:style w:type="character" w:customStyle="1" w:styleId="ErrorTok">
     <w:name w:val="ErrorTok"/>
     <w:basedOn w:val="VerbatimChar"/>
     <w:rPr>
-      <w:rFonts w:ascii="Consolas" w:hAnsi="Consolas"/>
+      <w:rFonts w:ascii="Century" w:hAnsi="Century" w:eastAsia="Century" w:cs="Century"/>
       <w:b/>
       <w:color w:val="FF0000"/>
-      <w:sz w:val="22"/>
+      <w:sz w:val="21"/>
+      <w:szCs w:val="21"/>
     </w:rPr>
   </w:style>
   <w:style w:type="character" w:customStyle="1" w:styleId="NormalTok">
     <w:name w:val="NormalTok"/>
     <w:basedOn w:val="VerbatimChar"/>
     <w:rPr>
-      <w:rFonts w:ascii="Consolas" w:hAnsi="Consolas"/>
-      <w:sz w:val="22"/>
+      <w:rFonts w:ascii="Century" w:hAnsi="Century" w:eastAsia="Century" w:cs="Century"/>
+      <w:sz w:val="21"/>
+      <w:szCs w:val="21"/>
     </w:rPr>
   </w:style>
   <w:style w:type="paragraph" w:styleId="TOC1">

</xml_diff>